<commit_message>
feat: complete rubric compliance and synchronize project documentation
Audit the project against the course rubric, integrate the Marsaglia Polar and Box-Muller comparison, recalibrate the simulation scenario, regenerate statistical evidence, and synchronize the Streamlit app, README, report, presentation, repository sheet, exposure script, tests, and generated assets.
</commit_message>
<xml_diff>
--- a/zombie_poisson_streamlit/presentation/ficha_repositorio.docx
+++ b/zombie_poisson_streamlit/presentation/ficha_repositorio.docx
@@ -2,19 +2,6 @@
 <file path=word/document.xml><?xml version="1.0" encoding="utf-8"?>
 <w:document xmlns:wpc="http://schemas.microsoft.com/office/word/2010/wordprocessingCanvas" xmlns:mo="http://schemas.microsoft.com/office/mac/office/2008/main" xmlns:mc="http://schemas.openxmlformats.org/markup-compatibility/2006" xmlns:mv="urn:schemas-microsoft-com:mac:vml" xmlns:o="urn:schemas-microsoft-com:office:office" xmlns:r="http://schemas.openxmlformats.org/officeDocument/2006/relationships" xmlns:m="http://schemas.openxmlformats.org/officeDocument/2006/math" xmlns:v="urn:schemas-microsoft-com:vml" xmlns:wp14="http://schemas.microsoft.com/office/word/2010/wordprocessingDrawing" xmlns:wp="http://schemas.openxmlformats.org/drawingml/2006/wordprocessingDrawing" xmlns:w10="urn:schemas-microsoft-com:office:word" xmlns:w="http://schemas.openxmlformats.org/wordprocessingml/2006/main" xmlns:w14="http://schemas.microsoft.com/office/word/2010/wordml" xmlns:wpg="http://schemas.microsoft.com/office/word/2010/wordprocessingGroup" xmlns:wpi="http://schemas.microsoft.com/office/word/2010/wordprocessingInk" xmlns:wne="http://schemas.microsoft.com/office/word/2006/wordml" xmlns:wps="http://schemas.microsoft.com/office/word/2010/wordprocessingShape" mc:Ignorable="w14 wp14">
   <w:body>
-    <w:p>
-      <w:pPr>
-        <w:jc w:val="center"/>
-      </w:pPr>
-      <w:r>
-        <w:rPr>
-          <w:b/>
-          <w:color w:val="567D35"/>
-          <w:sz w:val="20"/>
-        </w:rPr>
-        <w:t>UNIVERSIDAD DEL VALLE DE GUATEMALA</w:t>
-      </w:r>
-    </w:p>
     <w:p>
       <w:pPr>
         <w:pStyle w:val="Title"/>
@@ -22,27 +9,13 @@
       </w:pPr>
       <w:r>
         <w:t>OUTBREAK</w:t>
+        <w:br/>
       </w:r>
-    </w:p>
-    <w:p>
-      <w:pPr>
-        <w:pStyle w:val="Subtitle"/>
-        <w:jc w:val="center"/>
-      </w:pPr>
-      <w:r>
-        <w:t>STOCHASTIC SURVIVAL LAB</w:t>
-      </w:r>
-    </w:p>
-    <w:p>
-      <w:pPr>
-        <w:jc w:val="center"/>
-      </w:pPr>
       <w:r>
         <w:rPr>
-          <w:color w:val="617067"/>
-          <w:sz w:val="24"/>
+          <w:color w:val="276749"/>
         </w:rPr>
-        <w:t>Ficha técnica del repositorio · Proyecto 1 de Modelación y Simulación</w:t>
+        <w:t>Stochastic Survival Lab</w:t>
       </w:r>
     </w:p>
     <w:p>
@@ -52,7 +25,7 @@
       <w:r>
         <w:drawing>
           <wp:inline xmlns:a="http://schemas.openxmlformats.org/drawingml/2006/main" xmlns:pic="http://schemas.openxmlformats.org/drawingml/2006/picture">
-            <wp:extent cx="5989320" cy="3370784"/>
+            <wp:extent cx="6217920" cy="3499439"/>
             <wp:docPr id="1" name="Picture 1"/>
             <wp:cNvGraphicFramePr>
               <a:graphicFrameLocks noChangeAspect="1"/>
@@ -73,7 +46,7 @@
                   <pic:spPr>
                     <a:xfrm>
                       <a:off x="0" y="0"/>
-                      <a:ext cx="5989320" cy="3370784"/>
+                      <a:ext cx="6217920" cy="3499439"/>
                     </a:xfrm>
                     <a:prstGeom prst="rect"/>
                   </pic:spPr>
@@ -91,174 +64,150 @@
       <w:r>
         <w:rPr>
           <w:b/>
-          <w:color w:val="567D35"/>
         </w:rPr>
-        <w:t>Repositorio oficial</w:t>
+        <w:t>Ficha técnica del repositorio</w:t>
         <w:br/>
       </w:r>
+      <w:r>
+        <w:t>Grupo 1 · CC2017 · Sección 30 · 2026</w:t>
+      </w:r>
+    </w:p>
+    <w:p>
+      <w:pPr>
+        <w:jc w:val="center"/>
+      </w:pPr>
       <w:hyperlink r:id="rId12">
         <w:r>
           <w:rPr>
-            <w:color w:val="3D7F99"/>
+            <w:color w:val="2E75B6"/>
             <w:u w:val="single"/>
           </w:rPr>
-          <w:t>https://github.com/DanielBarillasM/Proyecto-1_Grupo-1_Modelacion-y-Simulacion_Sec-30</w:t>
+          <w:t>Abrir repositorio en GitHub</w:t>
         </w:r>
       </w:hyperlink>
     </w:p>
     <w:p>
       <w:pPr>
-        <w:jc w:val="center"/>
+        <w:pStyle w:val="Heading1"/>
       </w:pPr>
       <w:r>
-        <w:t>Pablo Daniel Barillas Moreno · Jorge Palacios</w:t>
-        <w:br/>
-        <w:t>Andrés Rafael Chivalán · Javier Andrés Chen</w:t>
+        <w:t>1. Propósito y pregunta</w:t>
+      </w:r>
+    </w:p>
+    <w:p>
+      <w:r>
+        <w:t>Se modela el subsistema real de aparición y balance de enemigos de un videojuego. La simulación conecta tiempos aleatorios de llegada con movimiento, combate y probabilidad de completar una misión de 90 s.</w:t>
+      </w:r>
+    </w:p>
+    <w:p>
+      <w:r>
+        <w:rPr>
+          <w:b/>
+        </w:rPr>
+        <w:t xml:space="preserve">Pregunta central. </w:t>
+      </w:r>
+      <w:r>
+        <w:t>¿Cómo cambian congestión y supervivencia al conservar la media, pero modificar la distribución de los interarribos?</w:t>
+      </w:r>
+    </w:p>
+    <w:p>
+      <w:pPr>
+        <w:pStyle w:val="ListBullet"/>
+      </w:pPr>
+      <w:r>
+        <w:t>Poisson homogéneo: interarribos exponenciales por transformada inversa.</w:t>
+      </w:r>
+    </w:p>
+    <w:p>
+      <w:pPr>
+        <w:pStyle w:val="ListBullet"/>
+      </w:pPr>
+      <w:r>
+        <w:t>Polar--lognormal: renovación positiva con media 1/lambda y CV configurable.</w:t>
+      </w:r>
+    </w:p>
+    <w:p>
+      <w:pPr>
+        <w:pStyle w:val="ListBullet"/>
+      </w:pPr>
+      <w:r>
+        <w:t>Comparación algorítmica: Marsaglia Polar y Box--Muller generan la misma N(0,1).</w:t>
+      </w:r>
+    </w:p>
+    <w:p>
+      <w:pPr>
+        <w:pStyle w:val="ListBullet"/>
+      </w:pPr>
+      <w:r>
+        <w:t>Monte Carlo pareado: Wilson, McNemar exacta, Wilcoxon y bootstrap.</w:t>
+      </w:r>
+    </w:p>
+    <w:p>
+      <w:pPr>
+        <w:pStyle w:val="Heading1"/>
+      </w:pPr>
+      <w:r>
+        <w:t>2. Modelo e implementación</w:t>
       </w:r>
     </w:p>
     <w:tbl>
       <w:tblPr>
+        <w:tblStyle w:val="LightShading-Accent1"/>
         <w:tblW w:type="auto" w:w="0"/>
+        <w:jc w:val="center"/>
         <w:tblLook w:firstColumn="1" w:firstRow="1" w:lastColumn="0" w:lastRow="0" w:noHBand="0" w:noVBand="1" w:val="04A0"/>
       </w:tblPr>
       <w:tblGrid>
-        <w:gridCol w:w="10166"/>
+        <w:gridCol w:w="3324"/>
+        <w:gridCol w:w="3324"/>
+        <w:gridCol w:w="3324"/>
       </w:tblGrid>
       <w:tr>
         <w:tc>
           <w:tcPr>
-            <w:tcW w:type="dxa" w:w="10166"/>
-            <w:shd w:fill="EEF3EE"/>
-            <w:tcMar>
-              <w:top w:w="150" w:type="dxa"/>
-              <w:start w:w="180" w:type="dxa"/>
-              <w:bottom w:w="150" w:type="dxa"/>
-              <w:end w:w="180" w:type="dxa"/>
-            </w:tcMar>
+            <w:tcW w:type="dxa" w:w="3324"/>
+            <w:shd w:fill="0B100D"/>
+            <w:vAlign w:val="center"/>
           </w:tcPr>
           <w:p>
             <w:r>
               <w:rPr>
                 <w:b/>
-                <w:color w:val="567D35"/>
+                <w:color w:val="9FE870"/>
               </w:rPr>
-              <w:t xml:space="preserve">Idea central: </w:t>
-            </w:r>
-            <w:r>
-              <w:t>Simular y comparar patrones de aparición de enemigos mediante Poisson y una renovación Polar-lognormal, cuantificando su efecto sobre congestión y supervivencia.</w:t>
+              <w:t>Componente</w:t>
             </w:r>
           </w:p>
         </w:tc>
-      </w:tr>
-    </w:tbl>
-    <w:p>
-      <w:pPr>
-        <w:spacing w:after="0"/>
-      </w:pPr>
-    </w:p>
-    <w:p>
-      <w:r>
-        <w:br w:type="page"/>
-      </w:r>
-    </w:p>
-    <w:tbl>
-      <w:tblPr>
-        <w:tblW w:type="auto" w:w="0"/>
-        <w:tblLayout w:type="autofit"/>
-        <w:tblLook w:firstColumn="1" w:firstRow="1" w:lastColumn="0" w:lastRow="0" w:noHBand="0" w:noVBand="1" w:val="04A0"/>
-      </w:tblPr>
-      <w:tblGrid>
-        <w:gridCol w:w="10166"/>
-      </w:tblGrid>
-      <w:tr>
         <w:tc>
           <w:tcPr>
-            <w:tcW w:type="dxa" w:w="10166"/>
-            <w:shd w:fill="567D35"/>
-            <w:tcMar>
-              <w:top w:w="80" w:type="dxa"/>
-              <w:start w:w="150" w:type="dxa"/>
-              <w:bottom w:w="80" w:type="dxa"/>
-              <w:end w:w="150" w:type="dxa"/>
-            </w:tcMar>
-          </w:tcPr>
-          <w:p>
-            <w:pPr>
-              <w:spacing w:after="0"/>
-            </w:pPr>
-            <w:r>
-              <w:rPr>
-                <w:b/>
-                <w:color w:val="FFFFFF"/>
-                <w:sz w:val="18"/>
-              </w:rPr>
-              <w:t>1 · IDENTIDAD Y ALCANCE</w:t>
-            </w:r>
-          </w:p>
-        </w:tc>
-      </w:tr>
-    </w:tbl>
-    <w:p>
-      <w:pPr>
-        <w:pStyle w:val="Heading1"/>
-      </w:pPr>
-      <w:r>
-        <w:t>Presentación del repositorio</w:t>
-      </w:r>
-    </w:p>
-    <w:p>
-      <w:r>
-        <w:t>Outbreak es una aplicación académica reproducible que integra generación de variables aleatorias continuas, simulación computacional, inferencia Monte Carlo y visualización tridimensional. La narrativa zombi contextualiza un sistema real de software: el subsistema que decide cuándo aparecen enemigos y cómo esa presión modifica el balance de una misión.</w:t>
-      </w:r>
-    </w:p>
-    <w:tbl>
-      <w:tblPr>
-        <w:tblW w:type="auto" w:w="0"/>
-        <w:tblLayout w:type="fixed"/>
-        <w:tblLook w:firstColumn="1" w:firstRow="1" w:lastColumn="0" w:lastRow="0" w:noHBand="0" w:noVBand="1" w:val="04A0"/>
-      </w:tblPr>
-      <w:tblGrid>
-        <w:gridCol w:w="2376"/>
-        <w:gridCol w:w="7776"/>
-      </w:tblGrid>
-      <w:tr>
-        <w:tc>
-          <w:tcPr>
-            <w:tcW w:type="dxa" w:w="2376"/>
-            <w:shd w:fill="567D35"/>
+            <w:tcW w:type="dxa" w:w="3324"/>
+            <w:shd w:fill="0B100D"/>
             <w:vAlign w:val="center"/>
-            <w:tcMar>
-              <w:top w:w="100" w:type="dxa"/>
-              <w:start w:w="120" w:type="dxa"/>
-              <w:bottom w:w="100" w:type="dxa"/>
-              <w:end w:w="120" w:type="dxa"/>
-            </w:tcMar>
           </w:tcPr>
           <w:p>
             <w:r>
               <w:rPr>
                 <w:b/>
-                <w:color w:val="FFFFFF"/>
+                <w:color w:val="9FE870"/>
               </w:rPr>
-              <w:t>Curso</w:t>
+              <w:t>Implementación</w:t>
             </w:r>
           </w:p>
         </w:tc>
         <w:tc>
           <w:tcPr>
-            <w:tcW w:type="dxa" w:w="7776"/>
-            <w:shd w:fill="F5F7F5"/>
+            <w:tcW w:type="dxa" w:w="3324"/>
+            <w:shd w:fill="0B100D"/>
             <w:vAlign w:val="center"/>
-            <w:tcMar>
-              <w:top w:w="100" w:type="dxa"/>
-              <w:start w:w="120" w:type="dxa"/>
-              <w:bottom w:w="100" w:type="dxa"/>
-              <w:end w:w="120" w:type="dxa"/>
-            </w:tcMar>
           </w:tcPr>
           <w:p>
             <w:r>
-              <w:t>CC2017 — Modelación y Simulación, Sección 30</w:t>
+              <w:rPr>
+                <w:b/>
+                <w:color w:val="9FE870"/>
+              </w:rPr>
+              <w:t>Propósito</w:t>
             </w:r>
           </w:p>
         </w:tc>
@@ -266,41 +215,34 @@
       <w:tr>
         <w:tc>
           <w:tcPr>
-            <w:tcW w:type="dxa" w:w="2376"/>
-            <w:shd w:fill="0B100D"/>
+            <w:tcW w:type="dxa" w:w="3324"/>
             <w:vAlign w:val="center"/>
-            <w:tcMar>
-              <w:top w:w="100" w:type="dxa"/>
-              <w:start w:w="120" w:type="dxa"/>
-              <w:bottom w:w="100" w:type="dxa"/>
-              <w:end w:w="120" w:type="dxa"/>
-            </w:tcMar>
           </w:tcPr>
           <w:p>
             <w:r>
-              <w:rPr>
-                <w:b/>
-                <w:color w:val="FFFFFF"/>
-              </w:rPr>
-              <w:t>Tipo</w:t>
+              <w:t>Llegadas</w:t>
             </w:r>
           </w:p>
         </w:tc>
         <w:tc>
           <w:tcPr>
-            <w:tcW w:type="dxa" w:w="7776"/>
-            <w:shd w:fill="E9EFEB"/>
+            <w:tcW w:type="dxa" w:w="3324"/>
             <w:vAlign w:val="center"/>
-            <w:tcMar>
-              <w:top w:w="100" w:type="dxa"/>
-              <w:start w:w="120" w:type="dxa"/>
-              <w:bottom w:w="100" w:type="dxa"/>
-              <w:end w:w="120" w:type="dxa"/>
-            </w:tcMar>
           </w:tcPr>
           <w:p>
             <w:r>
-              <w:t>Aplicación web interactiva y laboratorio estadístico</w:t>
+              <w:t>Delta = -ln(U)/lambda</w:t>
+            </w:r>
+          </w:p>
+        </w:tc>
+        <w:tc>
+          <w:tcPr>
+            <w:tcW w:type="dxa" w:w="3324"/>
+            <w:vAlign w:val="center"/>
+          </w:tcPr>
+          <w:p>
+            <w:r>
+              <w:t>Poisson de tasa constante</w:t>
             </w:r>
           </w:p>
         </w:tc>
@@ -308,41 +250,34 @@
       <w:tr>
         <w:tc>
           <w:tcPr>
-            <w:tcW w:type="dxa" w:w="2376"/>
-            <w:shd w:fill="567D35"/>
+            <w:tcW w:type="dxa" w:w="3324"/>
             <w:vAlign w:val="center"/>
-            <w:tcMar>
-              <w:top w:w="100" w:type="dxa"/>
-              <w:start w:w="120" w:type="dxa"/>
-              <w:bottom w:w="100" w:type="dxa"/>
-              <w:end w:w="120" w:type="dxa"/>
-            </w:tcMar>
           </w:tcPr>
           <w:p>
             <w:r>
-              <w:rPr>
-                <w:b/>
-                <w:color w:val="FFFFFF"/>
-              </w:rPr>
-              <w:t>Modelo principal</w:t>
+              <w:t>Contraste</w:t>
             </w:r>
           </w:p>
         </w:tc>
         <w:tc>
           <w:tcPr>
-            <w:tcW w:type="dxa" w:w="7776"/>
-            <w:shd w:fill="F5F7F5"/>
+            <w:tcW w:type="dxa" w:w="3324"/>
             <w:vAlign w:val="center"/>
-            <w:tcMar>
-              <w:top w:w="100" w:type="dxa"/>
-              <w:start w:w="120" w:type="dxa"/>
-              <w:bottom w:w="100" w:type="dxa"/>
-              <w:end w:w="120" w:type="dxa"/>
-            </w:tcMar>
           </w:tcPr>
           <w:p>
             <w:r>
-              <w:t>Proceso de Poisson homogéneo</w:t>
+              <w:t>Delta = exp(mu + sigma Z)</w:t>
+            </w:r>
+          </w:p>
+        </w:tc>
+        <w:tc>
+          <w:tcPr>
+            <w:tcW w:type="dxa" w:w="3324"/>
+            <w:vAlign w:val="center"/>
+          </w:tcPr>
+          <w:p>
+            <w:r>
+              <w:t>Media igual; variabilidad distinta</w:t>
             </w:r>
           </w:p>
         </w:tc>
@@ -350,41 +285,34 @@
       <w:tr>
         <w:tc>
           <w:tcPr>
-            <w:tcW w:type="dxa" w:w="2376"/>
-            <w:shd w:fill="0B100D"/>
+            <w:tcW w:type="dxa" w:w="3324"/>
             <w:vAlign w:val="center"/>
-            <w:tcMar>
-              <w:top w:w="100" w:type="dxa"/>
-              <w:start w:w="120" w:type="dxa"/>
-              <w:bottom w:w="100" w:type="dxa"/>
-              <w:end w:w="120" w:type="dxa"/>
-            </w:tcMar>
           </w:tcPr>
           <w:p>
             <w:r>
-              <w:rPr>
-                <w:b/>
-                <w:color w:val="FFFFFF"/>
-              </w:rPr>
-              <w:t>Contraste</w:t>
+              <w:t>Combate</w:t>
             </w:r>
           </w:p>
         </w:tc>
         <w:tc>
           <w:tcPr>
-            <w:tcW w:type="dxa" w:w="7776"/>
-            <w:shd w:fill="E9EFEB"/>
+            <w:tcW w:type="dxa" w:w="3324"/>
             <w:vAlign w:val="center"/>
-            <w:tcMar>
-              <w:top w:w="100" w:type="dxa"/>
-              <w:start w:w="120" w:type="dxa"/>
-              <w:bottom w:w="100" w:type="dxa"/>
-              <w:end w:w="120" w:type="dxa"/>
-            </w:tcMar>
           </w:tcPr>
           <w:p>
             <w:r>
-              <w:t>Renovación lognormal generada con Marsaglia Polar</w:t>
+              <w:t>Paso fijo dt = 0.05 s</w:t>
+            </w:r>
+          </w:p>
+        </w:tc>
+        <w:tc>
+          <w:tcPr>
+            <w:tcW w:type="dxa" w:w="3324"/>
+            <w:vAlign w:val="center"/>
+          </w:tcPr>
+          <w:p>
+            <w:r>
+              <w:t>Movimiento, alcance, contacto y daño</w:t>
             </w:r>
           </w:p>
         </w:tc>
@@ -392,41 +320,98 @@
       <w:tr>
         <w:tc>
           <w:tcPr>
-            <w:tcW w:type="dxa" w:w="2376"/>
-            <w:shd w:fill="567D35"/>
+            <w:tcW w:type="dxa" w:w="3324"/>
             <w:vAlign w:val="center"/>
-            <w:tcMar>
-              <w:top w:w="100" w:type="dxa"/>
-              <w:start w:w="120" w:type="dxa"/>
-              <w:bottom w:w="100" w:type="dxa"/>
-              <w:end w:w="120" w:type="dxa"/>
-            </w:tcMar>
+          </w:tcPr>
+          <w:p>
+            <w:r>
+              <w:t>Visual</w:t>
+            </w:r>
+          </w:p>
+        </w:tc>
+        <w:tc>
+          <w:tcPr>
+            <w:tcW w:type="dxa" w:w="3324"/>
+            <w:vAlign w:val="center"/>
+          </w:tcPr>
+          <w:p>
+            <w:r>
+              <w:t>Plotly Mesh3d</w:t>
+            </w:r>
+          </w:p>
+        </w:tc>
+        <w:tc>
+          <w:tcPr>
+            <w:tcW w:type="dxa" w:w="3324"/>
+            <w:vAlign w:val="center"/>
+          </w:tcPr>
+          <w:p>
+            <w:r>
+              <w:t>Escena navegable dentro de Streamlit</w:t>
+            </w:r>
+          </w:p>
+        </w:tc>
+      </w:tr>
+    </w:tbl>
+    <w:p/>
+    <w:tbl>
+      <w:tblPr>
+        <w:tblStyle w:val="LightShading-Accent1"/>
+        <w:tblW w:type="auto" w:w="0"/>
+        <w:jc w:val="center"/>
+        <w:tblLook w:firstColumn="1" w:firstRow="1" w:lastColumn="0" w:lastRow="0" w:noHBand="0" w:noVBand="1" w:val="04A0"/>
+      </w:tblPr>
+      <w:tblGrid>
+        <w:gridCol w:w="3324"/>
+        <w:gridCol w:w="3324"/>
+        <w:gridCol w:w="3324"/>
+      </w:tblGrid>
+      <w:tr>
+        <w:tc>
+          <w:tcPr>
+            <w:tcW w:type="dxa" w:w="3324"/>
+            <w:shd w:fill="0B100D"/>
+            <w:vAlign w:val="center"/>
           </w:tcPr>
           <w:p>
             <w:r>
               <w:rPr>
                 <w:b/>
-                <w:color w:val="FFFFFF"/>
+                <w:color w:val="9FE870"/>
               </w:rPr>
-              <w:t>Cantidad de interés</w:t>
+              <w:t>Parámetro base</w:t>
             </w:r>
           </w:p>
         </w:tc>
         <w:tc>
           <w:tcPr>
-            <w:tcW w:type="dxa" w:w="7776"/>
-            <w:shd w:fill="F5F7F5"/>
+            <w:tcW w:type="dxa" w:w="3324"/>
+            <w:shd w:fill="0B100D"/>
             <w:vAlign w:val="center"/>
-            <w:tcMar>
-              <w:top w:w="100" w:type="dxa"/>
-              <w:start w:w="120" w:type="dxa"/>
-              <w:bottom w:w="100" w:type="dxa"/>
-              <w:end w:w="120" w:type="dxa"/>
-            </w:tcMar>
           </w:tcPr>
           <w:p>
             <w:r>
-              <w:t>Probabilidad de supervivencia y congestión</w:t>
+              <w:rPr>
+                <w:b/>
+                <w:color w:val="9FE870"/>
+              </w:rPr>
+              <w:t>Valor</w:t>
+            </w:r>
+          </w:p>
+        </w:tc>
+        <w:tc>
+          <w:tcPr>
+            <w:tcW w:type="dxa" w:w="3324"/>
+            <w:shd w:fill="0B100D"/>
+            <w:vAlign w:val="center"/>
+          </w:tcPr>
+          <w:p>
+            <w:r>
+              <w:rPr>
+                <w:b/>
+                <w:color w:val="9FE870"/>
+              </w:rPr>
+              <w:t>Unidad</w:t>
             </w:r>
           </w:p>
         </w:tc>
@@ -434,41 +419,34 @@
       <w:tr>
         <w:tc>
           <w:tcPr>
-            <w:tcW w:type="dxa" w:w="2376"/>
-            <w:shd w:fill="0B100D"/>
+            <w:tcW w:type="dxa" w:w="3324"/>
             <w:vAlign w:val="center"/>
-            <w:tcMar>
-              <w:top w:w="100" w:type="dxa"/>
-              <w:start w:w="120" w:type="dxa"/>
-              <w:bottom w:w="100" w:type="dxa"/>
-              <w:end w:w="120" w:type="dxa"/>
-            </w:tcMar>
           </w:tcPr>
           <w:p>
             <w:r>
-              <w:rPr>
-                <w:b/>
-                <w:color w:val="FFFFFF"/>
-              </w:rPr>
-              <w:t>Interfaz</w:t>
+              <w:t>Tasa</w:t>
             </w:r>
           </w:p>
         </w:tc>
         <w:tc>
           <w:tcPr>
-            <w:tcW w:type="dxa" w:w="7776"/>
-            <w:shd w:fill="E9EFEB"/>
+            <w:tcW w:type="dxa" w:w="3324"/>
             <w:vAlign w:val="center"/>
-            <w:tcMar>
-              <w:top w:w="100" w:type="dxa"/>
-              <w:start w:w="120" w:type="dxa"/>
-              <w:bottom w:w="100" w:type="dxa"/>
-              <w:end w:w="120" w:type="dxa"/>
-            </w:tcMar>
           </w:tcPr>
           <w:p>
             <w:r>
-              <w:t>Python, Streamlit y Plotly Mesh3d</w:t>
+              <w:t>55.8</w:t>
+            </w:r>
+          </w:p>
+        </w:tc>
+        <w:tc>
+          <w:tcPr>
+            <w:tcW w:type="dxa" w:w="3324"/>
+            <w:vAlign w:val="center"/>
+          </w:tcPr>
+          <w:p>
+            <w:r>
+              <w:t>llegadas/min</w:t>
             </w:r>
           </w:p>
         </w:tc>
@@ -476,204 +454,173 @@
       <w:tr>
         <w:tc>
           <w:tcPr>
-            <w:tcW w:type="dxa" w:w="2376"/>
-            <w:shd w:fill="567D35"/>
+            <w:tcW w:type="dxa" w:w="3324"/>
             <w:vAlign w:val="center"/>
-            <w:tcMar>
-              <w:top w:w="100" w:type="dxa"/>
-              <w:start w:w="120" w:type="dxa"/>
-              <w:bottom w:w="100" w:type="dxa"/>
-              <w:end w:w="120" w:type="dxa"/>
-            </w:tcMar>
           </w:tcPr>
           <w:p>
             <w:r>
-              <w:rPr>
-                <w:b/>
-                <w:color w:val="FFFFFF"/>
-              </w:rPr>
-              <w:t>Licencia</w:t>
+              <w:t>CV Polar</w:t>
             </w:r>
           </w:p>
         </w:tc>
         <w:tc>
           <w:tcPr>
-            <w:tcW w:type="dxa" w:w="7776"/>
-            <w:shd w:fill="F5F7F5"/>
+            <w:tcW w:type="dxa" w:w="3324"/>
             <w:vAlign w:val="center"/>
-            <w:tcMar>
-              <w:top w:w="100" w:type="dxa"/>
-              <w:start w:w="120" w:type="dxa"/>
-              <w:bottom w:w="100" w:type="dxa"/>
-              <w:end w:w="120" w:type="dxa"/>
-            </w:tcMar>
           </w:tcPr>
           <w:p>
             <w:r>
-              <w:t>MIT</w:t>
+              <w:t>0.60</w:t>
+            </w:r>
+          </w:p>
+        </w:tc>
+        <w:tc>
+          <w:tcPr>
+            <w:tcW w:type="dxa" w:w="3324"/>
+            <w:vAlign w:val="center"/>
+          </w:tcPr>
+          <w:p>
+            <w:r>
+              <w:t>adimensional</w:t>
+            </w:r>
+          </w:p>
+        </w:tc>
+      </w:tr>
+      <w:tr>
+        <w:tc>
+          <w:tcPr>
+            <w:tcW w:type="dxa" w:w="3324"/>
+            <w:vAlign w:val="center"/>
+          </w:tcPr>
+          <w:p>
+            <w:r>
+              <w:t>Horizonte</w:t>
+            </w:r>
+          </w:p>
+        </w:tc>
+        <w:tc>
+          <w:tcPr>
+            <w:tcW w:type="dxa" w:w="3324"/>
+            <w:vAlign w:val="center"/>
+          </w:tcPr>
+          <w:p>
+            <w:r>
+              <w:t>90</w:t>
+            </w:r>
+          </w:p>
+        </w:tc>
+        <w:tc>
+          <w:tcPr>
+            <w:tcW w:type="dxa" w:w="3324"/>
+            <w:vAlign w:val="center"/>
+          </w:tcPr>
+          <w:p>
+            <w:r>
+              <w:t>s</w:t>
+            </w:r>
+          </w:p>
+        </w:tc>
+      </w:tr>
+      <w:tr>
+        <w:tc>
+          <w:tcPr>
+            <w:tcW w:type="dxa" w:w="3324"/>
+            <w:vAlign w:val="center"/>
+          </w:tcPr>
+          <w:p>
+            <w:r>
+              <w:t>HP / DPS protagonista</w:t>
+            </w:r>
+          </w:p>
+        </w:tc>
+        <w:tc>
+          <w:tcPr>
+            <w:tcW w:type="dxa" w:w="3324"/>
+            <w:vAlign w:val="center"/>
+          </w:tcPr>
+          <w:p>
+            <w:r>
+              <w:t>110 / 42</w:t>
+            </w:r>
+          </w:p>
+        </w:tc>
+        <w:tc>
+          <w:tcPr>
+            <w:tcW w:type="dxa" w:w="3324"/>
+            <w:vAlign w:val="center"/>
+          </w:tcPr>
+          <w:p>
+            <w:r>
+              <w:t>HP / HP por s</w:t>
+            </w:r>
+          </w:p>
+        </w:tc>
+      </w:tr>
+      <w:tr>
+        <w:tc>
+          <w:tcPr>
+            <w:tcW w:type="dxa" w:w="3324"/>
+            <w:vAlign w:val="center"/>
+          </w:tcPr>
+          <w:p>
+            <w:r>
+              <w:t>HP / velocidad / DPS infectado</w:t>
+            </w:r>
+          </w:p>
+        </w:tc>
+        <w:tc>
+          <w:tcPr>
+            <w:tcW w:type="dxa" w:w="3324"/>
+            <w:vAlign w:val="center"/>
+          </w:tcPr>
+          <w:p>
+            <w:r>
+              <w:t>42 / 1.55 / 9.5</w:t>
+            </w:r>
+          </w:p>
+        </w:tc>
+        <w:tc>
+          <w:tcPr>
+            <w:tcW w:type="dxa" w:w="3324"/>
+            <w:vAlign w:val="center"/>
+          </w:tcPr>
+          <w:p>
+            <w:r>
+              <w:t>HP / m por s / HP por s</w:t>
             </w:r>
           </w:p>
         </w:tc>
       </w:tr>
     </w:tbl>
+    <w:p/>
     <w:p>
-      <w:pPr>
-        <w:pStyle w:val="Heading2"/>
-      </w:pPr>
       <w:r>
-        <w:t>Pregunta de investigación</w:t>
-      </w:r>
-    </w:p>
-    <w:tbl>
-      <w:tblPr>
-        <w:tblW w:type="auto" w:w="0"/>
-        <w:tblLook w:firstColumn="1" w:firstRow="1" w:lastColumn="0" w:lastRow="0" w:noHBand="0" w:noVBand="1" w:val="04A0"/>
-      </w:tblPr>
-      <w:tblGrid>
-        <w:gridCol w:w="10166"/>
-      </w:tblGrid>
-      <w:tr>
-        <w:tc>
-          <w:tcPr>
-            <w:tcW w:type="dxa" w:w="10166"/>
-            <w:shd w:fill="EDF3F6"/>
-            <w:tcMar>
-              <w:top w:w="150" w:type="dxa"/>
-              <w:start w:w="180" w:type="dxa"/>
-              <w:bottom w:w="150" w:type="dxa"/>
-              <w:end w:w="180" w:type="dxa"/>
-            </w:tcMar>
-          </w:tcPr>
-          <w:p>
-            <w:r>
-              <w:rPr>
-                <w:b/>
-                <w:color w:val="567D35"/>
-              </w:rPr>
-              <w:t xml:space="preserve">Pregunta: </w:t>
-            </w:r>
-            <w:r>
-              <w:t>¿Cómo cambian la congestión, la supervivencia y el costo computacional cuando se conserva la tasa media, pero se modifica el método y la distribución de los interarribos?</w:t>
-            </w:r>
-          </w:p>
-        </w:tc>
-      </w:tr>
-    </w:tbl>
-    <w:p>
-      <w:pPr>
-        <w:spacing w:after="0"/>
-      </w:pPr>
-    </w:p>
-    <w:p>
-      <w:pPr>
-        <w:pStyle w:val="Heading2"/>
-      </w:pPr>
-      <w:r>
-        <w:t>Capacidades principales</w:t>
+        <w:t>La calibración evita un escenario saturado cerca de 100 %; no representa telemetría real y se acompaña de un barrido de tasas.</w:t>
       </w:r>
     </w:p>
     <w:p>
       <w:pPr>
-        <w:pStyle w:val="ListBullet"/>
-        <w:spacing w:after="60"/>
+        <w:sectPr>
+          <w:headerReference w:type="default" r:id="rId9"/>
+          <w:footerReference w:type="default" r:id="rId10"/>
+          <w:pgSz w:w="12240" w:h="15840"/>
+          <w:pgMar w:top="1020" w:right="1134" w:bottom="964" w:left="1134" w:header="720" w:footer="720" w:gutter="0"/>
+          <w:cols w:space="720"/>
+          <w:docGrid w:linePitch="360"/>
+        </w:sectPr>
       </w:pPr>
-      <w:r>
-        <w:t>Configurar tasa, duración, semilla, combate y variabilidad Polar.</w:t>
-      </w:r>
     </w:p>
-    <w:p>
-      <w:pPr>
-        <w:pStyle w:val="ListBullet"/>
-        <w:spacing w:after="60"/>
-      </w:pPr>
-      <w:r>
-        <w:t>Generar calendarios Poisson por transformada inversa.</w:t>
-      </w:r>
-    </w:p>
-    <w:p>
-      <w:pPr>
-        <w:pStyle w:val="ListBullet"/>
-        <w:spacing w:after="60"/>
-      </w:pPr>
-      <w:r>
-        <w:t>Generar normales con Marsaglia Polar e interarribos lognormales positivos.</w:t>
-      </w:r>
-    </w:p>
-    <w:p>
-      <w:pPr>
-        <w:pStyle w:val="ListBullet"/>
-        <w:spacing w:after="60"/>
-      </w:pPr>
-      <w:r>
-        <w:t>Explorar una misión mediante una escena 3D y telemetría temporal.</w:t>
-      </w:r>
-    </w:p>
-    <w:p>
-      <w:pPr>
-        <w:pStyle w:val="ListBullet"/>
-        <w:spacing w:after="60"/>
-      </w:pPr>
-      <w:r>
-        <w:t>Validar generadores con pruebas formales y momentos observados.</w:t>
-      </w:r>
-    </w:p>
-    <w:p>
-      <w:pPr>
-        <w:pStyle w:val="ListBullet"/>
-        <w:spacing w:after="60"/>
-      </w:pPr>
-      <w:r>
-        <w:t>Comparar modelos con diseño pareado, intervalos y pruebas estadísticas.</w:t>
-      </w:r>
-    </w:p>
-    <w:p>
-      <w:r>
-        <w:br w:type="page"/>
-      </w:r>
-    </w:p>
-    <w:tbl>
-      <w:tblPr>
-        <w:tblW w:type="auto" w:w="0"/>
-        <w:tblLayout w:type="autofit"/>
-        <w:tblLook w:firstColumn="1" w:firstRow="1" w:lastColumn="0" w:lastRow="0" w:noHBand="0" w:noVBand="1" w:val="04A0"/>
-      </w:tblPr>
-      <w:tblGrid>
-        <w:gridCol w:w="10166"/>
-      </w:tblGrid>
-      <w:tr>
-        <w:tc>
-          <w:tcPr>
-            <w:tcW w:type="dxa" w:w="10166"/>
-            <w:shd w:fill="567D35"/>
-            <w:tcMar>
-              <w:top w:w="80" w:type="dxa"/>
-              <w:start w:w="150" w:type="dxa"/>
-              <w:bottom w:w="80" w:type="dxa"/>
-              <w:end w:w="150" w:type="dxa"/>
-            </w:tcMar>
-          </w:tcPr>
-          <w:p>
-            <w:pPr>
-              <w:spacing w:after="0"/>
-            </w:pPr>
-            <w:r>
-              <w:rPr>
-                <w:b/>
-                <w:color w:val="FFFFFF"/>
-                <w:sz w:val="18"/>
-              </w:rPr>
-              <w:t>2 · FUNDAMENTO MATEMÁTICO</w:t>
-            </w:r>
-          </w:p>
-        </w:tc>
-      </w:tr>
-    </w:tbl>
     <w:p>
       <w:pPr>
         <w:pStyle w:val="Heading1"/>
       </w:pPr>
       <w:r>
-        <w:t>Dos pipelines de generación</w:t>
+        <w:t>3. Validación y comparación de métodos</w:t>
+      </w:r>
+    </w:p>
+    <w:p>
+      <w:r>
+        <w:t>La batería contiene 18 contrastes con corrección Holm: fuente uniforme (PCG64 y LCG propio), transformaciones, independencia, aceptación y conteo Poisson. Un contador uniforme pero predecible actúa como control negativo y falla las tres pruebas de dependencia.</w:t>
       </w:r>
     </w:p>
     <w:p>
@@ -683,7 +630,7 @@
       <w:r>
         <w:drawing>
           <wp:inline xmlns:a="http://schemas.openxmlformats.org/drawingml/2006/main" xmlns:pic="http://schemas.openxmlformats.org/drawingml/2006/picture">
-            <wp:extent cx="5806440" cy="3267859"/>
+            <wp:extent cx="6126480" cy="2633543"/>
             <wp:docPr id="2" name="Picture 2"/>
             <wp:cNvGraphicFramePr>
               <a:graphicFrameLocks noChangeAspect="1"/>
@@ -692,7 +639,7 @@
               <a:graphicData uri="http://schemas.openxmlformats.org/drawingml/2006/picture">
                 <pic:pic>
                   <pic:nvPicPr>
-                    <pic:cNvPr id="0" name="outbreak-tactical-model.png"/>
+                    <pic:cNvPr id="0" name="report-normal-method-comparison.png"/>
                     <pic:cNvPicPr/>
                   </pic:nvPicPr>
                   <pic:blipFill>
@@ -704,7 +651,7 @@
                   <pic:spPr>
                     <a:xfrm>
                       <a:off x="0" y="0"/>
-                      <a:ext cx="5806440" cy="3267859"/>
+                      <a:ext cx="6126480" cy="2633543"/>
                     </a:xfrm>
                     <a:prstGeom prst="rect"/>
                   </pic:spPr>
@@ -717,57 +664,79 @@
     </w:p>
     <w:tbl>
       <w:tblPr>
+        <w:tblStyle w:val="LightShading-Accent1"/>
         <w:tblW w:type="auto" w:w="0"/>
+        <w:jc w:val="center"/>
         <w:tblLook w:firstColumn="1" w:firstRow="1" w:lastColumn="0" w:lastRow="0" w:noHBand="0" w:noVBand="1" w:val="04A0"/>
       </w:tblPr>
       <w:tblGrid>
-        <w:gridCol w:w="3389"/>
-        <w:gridCol w:w="3389"/>
-        <w:gridCol w:w="3389"/>
+        <w:gridCol w:w="2493"/>
+        <w:gridCol w:w="2493"/>
+        <w:gridCol w:w="2493"/>
+        <w:gridCol w:w="2493"/>
       </w:tblGrid>
       <w:tr>
         <w:tc>
           <w:tcPr>
-            <w:tcW w:type="dxa" w:w="3389"/>
+            <w:tcW w:type="dxa" w:w="2493"/>
             <w:shd w:fill="0B100D"/>
+            <w:vAlign w:val="center"/>
           </w:tcPr>
           <w:p>
             <w:r>
               <w:rPr>
                 <w:b/>
-                <w:color w:val="B8F36B"/>
+                <w:color w:val="9FE870"/>
               </w:rPr>
-              <w:t>Criterio</w:t>
+              <w:t>Método normal</w:t>
             </w:r>
           </w:p>
         </w:tc>
         <w:tc>
           <w:tcPr>
-            <w:tcW w:type="dxa" w:w="3389"/>
+            <w:tcW w:type="dxa" w:w="2493"/>
             <w:shd w:fill="0B100D"/>
+            <w:vAlign w:val="center"/>
           </w:tcPr>
           <w:p>
             <w:r>
               <w:rPr>
                 <w:b/>
-                <w:color w:val="B8F36B"/>
+                <w:color w:val="9FE870"/>
               </w:rPr>
-              <w:t>Poisson-exponencial</w:t>
+              <w:t>KS p</w:t>
             </w:r>
           </w:p>
         </w:tc>
         <w:tc>
           <w:tcPr>
-            <w:tcW w:type="dxa" w:w="3389"/>
+            <w:tcW w:type="dxa" w:w="2493"/>
             <w:shd w:fill="0B100D"/>
+            <w:vAlign w:val="center"/>
           </w:tcPr>
           <w:p>
             <w:r>
               <w:rPr>
                 <w:b/>
-                <w:color w:val="B8F36B"/>
+                <w:color w:val="9FE870"/>
               </w:rPr>
-              <w:t>Polar-lognormal</w:t>
+              <w:t>Rechazo</w:t>
+            </w:r>
+          </w:p>
+        </w:tc>
+        <w:tc>
+          <w:tcPr>
+            <w:tcW w:type="dxa" w:w="2493"/>
+            <w:shd w:fill="0B100D"/>
+            <w:vAlign w:val="center"/>
+          </w:tcPr>
+          <w:p>
+            <w:r>
+              <w:rPr>
+                <w:b/>
+                <w:color w:val="9FE870"/>
+              </w:rPr>
+              <w:t>Puntaje / 5</w:t>
             </w:r>
           </w:p>
         </w:tc>
@@ -775,52 +744,45 @@
       <w:tr>
         <w:tc>
           <w:tcPr>
-            <w:tcW w:type="dxa" w:w="3389"/>
-            <w:shd w:fill="F4F7F4"/>
-            <w:tcMar>
-              <w:top w:w="100" w:type="dxa"/>
-              <w:start w:w="120" w:type="dxa"/>
-              <w:bottom w:w="100" w:type="dxa"/>
-              <w:end w:w="120" w:type="dxa"/>
-            </w:tcMar>
+            <w:tcW w:type="dxa" w:w="2493"/>
+            <w:vAlign w:val="center"/>
           </w:tcPr>
           <w:p>
             <w:r>
-              <w:t>Interarribo</w:t>
+              <w:t>Marsaglia Polar</w:t>
             </w:r>
           </w:p>
         </w:tc>
         <w:tc>
           <w:tcPr>
-            <w:tcW w:type="dxa" w:w="3389"/>
-            <w:shd w:fill="F4F7F4"/>
-            <w:tcMar>
-              <w:top w:w="100" w:type="dxa"/>
-              <w:start w:w="120" w:type="dxa"/>
-              <w:bottom w:w="100" w:type="dxa"/>
-              <w:end w:w="120" w:type="dxa"/>
-            </w:tcMar>
+            <w:tcW w:type="dxa" w:w="2493"/>
+            <w:vAlign w:val="center"/>
           </w:tcPr>
           <w:p>
             <w:r>
-              <w:t>Exponencial</w:t>
+              <w:t>0.1337</w:t>
             </w:r>
           </w:p>
         </w:tc>
         <w:tc>
           <w:tcPr>
-            <w:tcW w:type="dxa" w:w="3389"/>
-            <w:shd w:fill="F4F7F4"/>
-            <w:tcMar>
-              <w:top w:w="100" w:type="dxa"/>
-              <w:start w:w="120" w:type="dxa"/>
-              <w:bottom w:w="100" w:type="dxa"/>
-              <w:end w:w="120" w:type="dxa"/>
-            </w:tcMar>
+            <w:tcW w:type="dxa" w:w="2493"/>
+            <w:vAlign w:val="center"/>
           </w:tcPr>
           <w:p>
             <w:r>
-              <w:t>Lognormal</w:t>
+              <w:t>21.8 %</w:t>
+            </w:r>
+          </w:p>
+        </w:tc>
+        <w:tc>
+          <w:tcPr>
+            <w:tcW w:type="dxa" w:w="2493"/>
+            <w:vAlign w:val="center"/>
+          </w:tcPr>
+          <w:p>
+            <w:r>
+              <w:t>3.908</w:t>
             </w:r>
           </w:p>
         </w:tc>
@@ -828,52 +790,122 @@
       <w:tr>
         <w:tc>
           <w:tcPr>
-            <w:tcW w:type="dxa" w:w="3389"/>
-            <w:shd w:fill="E8EFEA"/>
-            <w:tcMar>
-              <w:top w:w="100" w:type="dxa"/>
-              <w:start w:w="120" w:type="dxa"/>
-              <w:bottom w:w="100" w:type="dxa"/>
-              <w:end w:w="120" w:type="dxa"/>
-            </w:tcMar>
+            <w:tcW w:type="dxa" w:w="2493"/>
+            <w:vAlign w:val="center"/>
           </w:tcPr>
           <w:p>
             <w:r>
-              <w:t>Método</w:t>
+              <w:t>Box--Muller</w:t>
             </w:r>
           </w:p>
         </w:tc>
         <w:tc>
           <w:tcPr>
-            <w:tcW w:type="dxa" w:w="3389"/>
-            <w:shd w:fill="E8EFEA"/>
-            <w:tcMar>
-              <w:top w:w="100" w:type="dxa"/>
-              <w:start w:w="120" w:type="dxa"/>
-              <w:bottom w:w="100" w:type="dxa"/>
-              <w:end w:w="120" w:type="dxa"/>
-            </w:tcMar>
+            <w:tcW w:type="dxa" w:w="2493"/>
+            <w:vAlign w:val="center"/>
           </w:tcPr>
           <w:p>
             <w:r>
-              <w:t>Transformada inversa</w:t>
+              <w:t>0.3288</w:t>
             </w:r>
           </w:p>
         </w:tc>
         <w:tc>
           <w:tcPr>
-            <w:tcW w:type="dxa" w:w="3389"/>
-            <w:shd w:fill="E8EFEA"/>
-            <w:tcMar>
-              <w:top w:w="100" w:type="dxa"/>
-              <w:start w:w="120" w:type="dxa"/>
-              <w:bottom w:w="100" w:type="dxa"/>
-              <w:end w:w="120" w:type="dxa"/>
-            </w:tcMar>
+            <w:tcW w:type="dxa" w:w="2493"/>
+            <w:vAlign w:val="center"/>
           </w:tcPr>
           <w:p>
             <w:r>
-              <w:t>Marsaglia + transformación</w:t>
+              <w:t>0 %</w:t>
+            </w:r>
+          </w:p>
+        </w:tc>
+        <w:tc>
+          <w:tcPr>
+            <w:tcW w:type="dxa" w:w="2493"/>
+            <w:vAlign w:val="center"/>
+          </w:tcPr>
+          <w:p>
+            <w:r>
+              <w:t>4.800</w:t>
+            </w:r>
+          </w:p>
+        </w:tc>
+      </w:tr>
+    </w:tbl>
+    <w:p/>
+    <w:p>
+      <w:r>
+        <w:t>Ambos métodos son compatibles con N(0,1). La matriz favorece a Box-Muller en el equipo de referencia; no interpreta un valor p mayor como mejor ajuste.</w:t>
+      </w:r>
+    </w:p>
+    <w:p>
+      <w:pPr>
+        <w:pStyle w:val="Heading1"/>
+      </w:pPr>
+      <w:r>
+        <w:t>4. Resultado reproducible</w:t>
+      </w:r>
+    </w:p>
+    <w:tbl>
+      <w:tblPr>
+        <w:tblStyle w:val="LightShading-Accent1"/>
+        <w:tblW w:type="auto" w:w="0"/>
+        <w:jc w:val="center"/>
+        <w:tblLook w:firstColumn="1" w:firstRow="1" w:lastColumn="0" w:lastRow="0" w:noHBand="0" w:noVBand="1" w:val="04A0"/>
+      </w:tblPr>
+      <w:tblGrid>
+        <w:gridCol w:w="3324"/>
+        <w:gridCol w:w="3324"/>
+        <w:gridCol w:w="3324"/>
+      </w:tblGrid>
+      <w:tr>
+        <w:tc>
+          <w:tcPr>
+            <w:tcW w:type="dxa" w:w="3324"/>
+            <w:shd w:fill="0B100D"/>
+            <w:vAlign w:val="center"/>
+          </w:tcPr>
+          <w:p>
+            <w:r>
+              <w:rPr>
+                <w:b/>
+                <w:color w:val="9FE870"/>
+              </w:rPr>
+              <w:t>Métrica (400 corridas)</w:t>
+            </w:r>
+          </w:p>
+        </w:tc>
+        <w:tc>
+          <w:tcPr>
+            <w:tcW w:type="dxa" w:w="3324"/>
+            <w:shd w:fill="0B100D"/>
+            <w:vAlign w:val="center"/>
+          </w:tcPr>
+          <w:p>
+            <w:r>
+              <w:rPr>
+                <w:b/>
+                <w:color w:val="9FE870"/>
+              </w:rPr>
+              <w:t>Poisson</w:t>
+            </w:r>
+          </w:p>
+        </w:tc>
+        <w:tc>
+          <w:tcPr>
+            <w:tcW w:type="dxa" w:w="3324"/>
+            <w:shd w:fill="0B100D"/>
+            <w:vAlign w:val="center"/>
+          </w:tcPr>
+          <w:p>
+            <w:r>
+              <w:rPr>
+                <w:b/>
+                <w:color w:val="9FE870"/>
+              </w:rPr>
+              <w:t>Polar--lognormal</w:t>
             </w:r>
           </w:p>
         </w:tc>
@@ -881,996 +913,8 @@
       <w:tr>
         <w:tc>
           <w:tcPr>
-            <w:tcW w:type="dxa" w:w="3389"/>
-            <w:shd w:fill="F4F7F4"/>
-            <w:tcMar>
-              <w:top w:w="100" w:type="dxa"/>
-              <w:start w:w="120" w:type="dxa"/>
-              <w:bottom w:w="100" w:type="dxa"/>
-              <w:end w:w="120" w:type="dxa"/>
-            </w:tcMar>
-          </w:tcPr>
-          <w:p>
-            <w:r>
-              <w:t>Media</w:t>
-            </w:r>
-          </w:p>
-        </w:tc>
-        <w:tc>
-          <w:tcPr>
-            <w:tcW w:type="dxa" w:w="3389"/>
-            <w:shd w:fill="F4F7F4"/>
-            <w:tcMar>
-              <w:top w:w="100" w:type="dxa"/>
-              <w:start w:w="120" w:type="dxa"/>
-              <w:bottom w:w="100" w:type="dxa"/>
-              <w:end w:w="120" w:type="dxa"/>
-            </w:tcMar>
-          </w:tcPr>
-          <w:p>
-            <w:r>
-              <w:t>1/λ</w:t>
-            </w:r>
-          </w:p>
-        </w:tc>
-        <w:tc>
-          <w:tcPr>
-            <w:tcW w:type="dxa" w:w="3389"/>
-            <w:shd w:fill="F4F7F4"/>
-            <w:tcMar>
-              <w:top w:w="100" w:type="dxa"/>
-              <w:start w:w="120" w:type="dxa"/>
-              <w:bottom w:w="100" w:type="dxa"/>
-              <w:end w:w="120" w:type="dxa"/>
-            </w:tcMar>
-          </w:tcPr>
-          <w:p>
-            <w:r>
-              <w:t>1/λ</w:t>
-            </w:r>
-          </w:p>
-        </w:tc>
-      </w:tr>
-      <w:tr>
-        <w:tc>
-          <w:tcPr>
-            <w:tcW w:type="dxa" w:w="3389"/>
-            <w:shd w:fill="E8EFEA"/>
-            <w:tcMar>
-              <w:top w:w="100" w:type="dxa"/>
-              <w:start w:w="120" w:type="dxa"/>
-              <w:bottom w:w="100" w:type="dxa"/>
-              <w:end w:w="120" w:type="dxa"/>
-            </w:tcMar>
-          </w:tcPr>
-          <w:p>
-            <w:r>
-              <w:t>CV base</w:t>
-            </w:r>
-          </w:p>
-        </w:tc>
-        <w:tc>
-          <w:tcPr>
-            <w:tcW w:type="dxa" w:w="3389"/>
-            <w:shd w:fill="E8EFEA"/>
-            <w:tcMar>
-              <w:top w:w="100" w:type="dxa"/>
-              <w:start w:w="120" w:type="dxa"/>
-              <w:bottom w:w="100" w:type="dxa"/>
-              <w:end w:w="120" w:type="dxa"/>
-            </w:tcMar>
-          </w:tcPr>
-          <w:p>
-            <w:r>
-              <w:t>1</w:t>
-            </w:r>
-          </w:p>
-        </w:tc>
-        <w:tc>
-          <w:tcPr>
-            <w:tcW w:type="dxa" w:w="3389"/>
-            <w:shd w:fill="E8EFEA"/>
-            <w:tcMar>
-              <w:top w:w="100" w:type="dxa"/>
-              <w:start w:w="120" w:type="dxa"/>
-              <w:bottom w:w="100" w:type="dxa"/>
-              <w:end w:w="120" w:type="dxa"/>
-            </w:tcMar>
-          </w:tcPr>
-          <w:p>
-            <w:r>
-              <w:t>0.45</w:t>
-            </w:r>
-          </w:p>
-        </w:tc>
-      </w:tr>
-      <w:tr>
-        <w:tc>
-          <w:tcPr>
-            <w:tcW w:type="dxa" w:w="3389"/>
-            <w:shd w:fill="F4F7F4"/>
-            <w:tcMar>
-              <w:top w:w="100" w:type="dxa"/>
-              <w:start w:w="120" w:type="dxa"/>
-              <w:bottom w:w="100" w:type="dxa"/>
-              <w:end w:w="120" w:type="dxa"/>
-            </w:tcMar>
-          </w:tcPr>
-          <w:p>
-            <w:r>
-              <w:t>Conteo</w:t>
-            </w:r>
-          </w:p>
-        </w:tc>
-        <w:tc>
-          <w:tcPr>
-            <w:tcW w:type="dxa" w:w="3389"/>
-            <w:shd w:fill="F4F7F4"/>
-            <w:tcMar>
-              <w:top w:w="100" w:type="dxa"/>
-              <w:start w:w="120" w:type="dxa"/>
-              <w:bottom w:w="100" w:type="dxa"/>
-              <w:end w:w="120" w:type="dxa"/>
-            </w:tcMar>
-          </w:tcPr>
-          <w:p>
-            <w:r>
-              <w:t>Poisson exacto</w:t>
-            </w:r>
-          </w:p>
-        </w:tc>
-        <w:tc>
-          <w:tcPr>
-            <w:tcW w:type="dxa" w:w="3389"/>
-            <w:shd w:fill="F4F7F4"/>
-            <w:tcMar>
-              <w:top w:w="100" w:type="dxa"/>
-              <w:start w:w="120" w:type="dxa"/>
-              <w:bottom w:w="100" w:type="dxa"/>
-              <w:end w:w="120" w:type="dxa"/>
-            </w:tcMar>
-          </w:tcPr>
-          <w:p>
-            <w:r>
-              <w:t>Renovación</w:t>
-            </w:r>
-          </w:p>
-        </w:tc>
-      </w:tr>
-      <w:tr>
-        <w:tc>
-          <w:tcPr>
-            <w:tcW w:type="dxa" w:w="3389"/>
-            <w:shd w:fill="E8EFEA"/>
-            <w:tcMar>
-              <w:top w:w="100" w:type="dxa"/>
-              <w:start w:w="120" w:type="dxa"/>
-              <w:bottom w:w="100" w:type="dxa"/>
-              <w:end w:w="120" w:type="dxa"/>
-            </w:tcMar>
-          </w:tcPr>
-          <w:p>
-            <w:r>
-              <w:t>Memoria</w:t>
-            </w:r>
-          </w:p>
-        </w:tc>
-        <w:tc>
-          <w:tcPr>
-            <w:tcW w:type="dxa" w:w="3389"/>
-            <w:shd w:fill="E8EFEA"/>
-            <w:tcMar>
-              <w:top w:w="100" w:type="dxa"/>
-              <w:start w:w="120" w:type="dxa"/>
-              <w:bottom w:w="100" w:type="dxa"/>
-              <w:end w:w="120" w:type="dxa"/>
-            </w:tcMar>
-          </w:tcPr>
-          <w:p>
-            <w:r>
-              <w:t>Sin memoria</w:t>
-            </w:r>
-          </w:p>
-        </w:tc>
-        <w:tc>
-          <w:tcPr>
-            <w:tcW w:type="dxa" w:w="3389"/>
-            <w:shd w:fill="E8EFEA"/>
-            <w:tcMar>
-              <w:top w:w="100" w:type="dxa"/>
-              <w:start w:w="120" w:type="dxa"/>
-              <w:bottom w:w="100" w:type="dxa"/>
-              <w:end w:w="120" w:type="dxa"/>
-            </w:tcMar>
-          </w:tcPr>
-          <w:p>
-            <w:r>
-              <w:t>No exponencial</w:t>
-            </w:r>
-          </w:p>
-        </w:tc>
-      </w:tr>
-    </w:tbl>
-    <w:p>
-      <w:pPr>
-        <w:pStyle w:val="Heading2"/>
-      </w:pPr>
-      <w:r>
-        <w:t>Ecuaciones esenciales</w:t>
-      </w:r>
-    </w:p>
-    <w:tbl>
-      <w:tblPr>
-        <w:tblW w:type="auto" w:w="0"/>
-        <w:tblLook w:firstColumn="1" w:firstRow="1" w:lastColumn="0" w:lastRow="0" w:noHBand="0" w:noVBand="1" w:val="04A0"/>
-      </w:tblPr>
-      <w:tblGrid>
-        <w:gridCol w:w="10166"/>
-      </w:tblGrid>
-      <w:tr>
-        <w:tc>
-          <w:tcPr>
-            <w:tcW w:type="dxa" w:w="10166"/>
-            <w:shd w:fill="0B100D"/>
-            <w:tcMar>
-              <w:top w:w="140" w:type="dxa"/>
-              <w:start w:w="180" w:type="dxa"/>
-              <w:bottom w:w="140" w:type="dxa"/>
-              <w:end w:w="180" w:type="dxa"/>
-            </w:tcMar>
-          </w:tcPr>
-          <w:p>
-            <w:pPr>
-              <w:spacing w:after="0"/>
-            </w:pPr>
-            <w:r>
-              <w:rPr>
-                <w:rFonts w:ascii="Consolas" w:hAnsi="Consolas"/>
-                <w:color w:val="B8F36B"/>
-                <w:sz w:val="18"/>
-              </w:rPr>
-              <w:t>N(t) ~ Poisson(λt)        E[N(t)] = Var[N(t)] = λt</w:t>
-              <w:br/>
-            </w:r>
-            <w:r>
-              <w:rPr>
-                <w:rFonts w:ascii="Consolas" w:hAnsi="Consolas"/>
-                <w:color w:val="B8F36B"/>
-                <w:sz w:val="18"/>
-              </w:rPr>
-              <w:t>Δ = −ln(U)/λ             tᵢ = tᵢ₋₁ + Δᵢ</w:t>
-              <w:br/>
-            </w:r>
-            <w:r>
-              <w:rPr>
-                <w:rFonts w:ascii="Consolas" w:hAnsi="Consolas"/>
-                <w:color w:val="B8F36B"/>
-                <w:sz w:val="18"/>
-              </w:rPr>
-              <w:t>Z = V · √(−2 ln(S)/S)    S = V₁² + V₂²</w:t>
-              <w:br/>
-            </w:r>
-            <w:r>
-              <w:rPr>
-                <w:rFonts w:ascii="Consolas" w:hAnsi="Consolas"/>
-                <w:color w:val="B8F36B"/>
-                <w:sz w:val="18"/>
-              </w:rPr>
-              <w:t>Δ = exp(μ + σZ)          σ² = ln(1+c²)</w:t>
-              <w:br/>
-            </w:r>
-            <w:r>
-              <w:rPr>
-                <w:rFonts w:ascii="Consolas" w:hAnsi="Consolas"/>
-                <w:color w:val="B8F36B"/>
-                <w:sz w:val="18"/>
-              </w:rPr>
-              <w:t>μ = ln(1/λ) − σ²/2       E[Δ] = 1/λ</w:t>
-            </w:r>
-          </w:p>
-        </w:tc>
-      </w:tr>
-    </w:tbl>
-    <w:tbl>
-      <w:tblPr>
-        <w:tblW w:type="auto" w:w="0"/>
-        <w:tblLook w:firstColumn="1" w:firstRow="1" w:lastColumn="0" w:lastRow="0" w:noHBand="0" w:noVBand="1" w:val="04A0"/>
-      </w:tblPr>
-      <w:tblGrid>
-        <w:gridCol w:w="10166"/>
-      </w:tblGrid>
-      <w:tr>
-        <w:tc>
-          <w:tcPr>
-            <w:tcW w:type="dxa" w:w="10166"/>
-            <w:shd w:fill="EEF3EE"/>
-            <w:tcMar>
-              <w:top w:w="150" w:type="dxa"/>
-              <w:start w:w="180" w:type="dxa"/>
-              <w:bottom w:w="150" w:type="dxa"/>
-              <w:end w:w="180" w:type="dxa"/>
-            </w:tcMar>
-          </w:tcPr>
-          <w:p>
-            <w:r>
-              <w:rPr>
-                <w:b/>
-                <w:color w:val="567D35"/>
-              </w:rPr>
-              <w:t xml:space="preserve">Distinción esencial: </w:t>
-            </w:r>
-            <w:r>
-              <w:t>Marsaglia Polar no es otro proceso de Poisson. Produce normales que se transforman en interarribos lognormales; por ello el modelo alternativo es un proceso de renovación.</w:t>
-            </w:r>
-          </w:p>
-        </w:tc>
-      </w:tr>
-    </w:tbl>
-    <w:p>
-      <w:pPr>
-        <w:spacing w:after="0"/>
-      </w:pPr>
-    </w:p>
-    <w:p>
-      <w:r>
-        <w:br w:type="page"/>
-      </w:r>
-    </w:p>
-    <w:tbl>
-      <w:tblPr>
-        <w:tblW w:type="auto" w:w="0"/>
-        <w:tblLayout w:type="autofit"/>
-        <w:tblLook w:firstColumn="1" w:firstRow="1" w:lastColumn="0" w:lastRow="0" w:noHBand="0" w:noVBand="1" w:val="04A0"/>
-      </w:tblPr>
-      <w:tblGrid>
-        <w:gridCol w:w="10166"/>
-      </w:tblGrid>
-      <w:tr>
-        <w:tc>
-          <w:tcPr>
-            <w:tcW w:type="dxa" w:w="10166"/>
-            <w:shd w:fill="567D35"/>
-            <w:tcMar>
-              <w:top w:w="80" w:type="dxa"/>
-              <w:start w:w="150" w:type="dxa"/>
-              <w:bottom w:w="80" w:type="dxa"/>
-              <w:end w:w="150" w:type="dxa"/>
-            </w:tcMar>
-          </w:tcPr>
-          <w:p>
-            <w:pPr>
-              <w:spacing w:after="0"/>
-            </w:pPr>
-            <w:r>
-              <w:rPr>
-                <w:b/>
-                <w:color w:val="FFFFFF"/>
-                <w:sz w:val="18"/>
-              </w:rPr>
-              <w:t>3 · ARQUITECTURA Y EJECUCIÓN</w:t>
-            </w:r>
-          </w:p>
-        </w:tc>
-      </w:tr>
-    </w:tbl>
-    <w:p>
-      <w:pPr>
-        <w:pStyle w:val="Heading1"/>
-      </w:pPr>
-      <w:r>
-        <w:t>Organización del proyecto</w:t>
-      </w:r>
-    </w:p>
-    <w:tbl>
-      <w:tblPr>
-        <w:tblW w:type="auto" w:w="0"/>
-        <w:tblLook w:firstColumn="1" w:firstRow="1" w:lastColumn="0" w:lastRow="0" w:noHBand="0" w:noVBand="1" w:val="04A0"/>
-      </w:tblPr>
-      <w:tblGrid>
-        <w:gridCol w:w="10166"/>
-      </w:tblGrid>
-      <w:tr>
-        <w:tc>
-          <w:tcPr>
-            <w:tcW w:type="dxa" w:w="10166"/>
-            <w:shd w:fill="0B100D"/>
-            <w:tcMar>
-              <w:top w:w="140" w:type="dxa"/>
-              <w:start w:w="180" w:type="dxa"/>
-              <w:bottom w:w="140" w:type="dxa"/>
-              <w:end w:w="180" w:type="dxa"/>
-            </w:tcMar>
-          </w:tcPr>
-          <w:p>
-            <w:pPr>
-              <w:spacing w:after="0"/>
-            </w:pPr>
-            <w:r>
-              <w:rPr>
-                <w:rFonts w:ascii="Consolas" w:hAnsi="Consolas"/>
-                <w:color w:val="B8F36B"/>
-                <w:sz w:val="18"/>
-              </w:rPr>
-              <w:t>zombie_poisson_streamlit/</w:t>
-              <w:br/>
-            </w:r>
-            <w:r>
-              <w:rPr>
-                <w:rFonts w:ascii="Consolas" w:hAnsi="Consolas"/>
-                <w:color w:val="B8F36B"/>
-                <w:sz w:val="18"/>
-              </w:rPr>
-              <w:t>├── App/              interfaz, motor y visualizaciones</w:t>
-              <w:br/>
-            </w:r>
-            <w:r>
-              <w:rPr>
-                <w:rFonts w:ascii="Consolas" w:hAnsi="Consolas"/>
-                <w:color w:val="B8F36B"/>
-                <w:sz w:val="18"/>
-              </w:rPr>
-              <w:t>├── assets/           imágenes y figuras reproducibles</w:t>
-              <w:br/>
-            </w:r>
-            <w:r>
-              <w:rPr>
-                <w:rFonts w:ascii="Consolas" w:hAnsi="Consolas"/>
-                <w:color w:val="B8F36B"/>
-                <w:sz w:val="18"/>
-              </w:rPr>
-              <w:t>├── presentation/     presentación y guion de exposición</w:t>
-              <w:br/>
-            </w:r>
-            <w:r>
-              <w:rPr>
-                <w:rFonts w:ascii="Consolas" w:hAnsi="Consolas"/>
-                <w:color w:val="B8F36B"/>
-                <w:sz w:val="18"/>
-              </w:rPr>
-              <w:t>├── report/           informe, datos y generador de resultados</w:t>
-              <w:br/>
-            </w:r>
-            <w:r>
-              <w:rPr>
-                <w:rFonts w:ascii="Consolas" w:hAnsi="Consolas"/>
-                <w:color w:val="B8F36B"/>
-                <w:sz w:val="18"/>
-              </w:rPr>
-              <w:t>├── requirements/     dependencias fijadas</w:t>
-              <w:br/>
-            </w:r>
-            <w:r>
-              <w:rPr>
-                <w:rFonts w:ascii="Consolas" w:hAnsi="Consolas"/>
-                <w:color w:val="B8F36B"/>
-                <w:sz w:val="18"/>
-              </w:rPr>
-              <w:t>└── tests/            pruebas automatizadas</w:t>
-            </w:r>
-          </w:p>
-        </w:tc>
-      </w:tr>
-    </w:tbl>
-    <w:p>
-      <w:pPr>
-        <w:pStyle w:val="Heading2"/>
-      </w:pPr>
-      <w:r>
-        <w:t>Responsabilidades del código</w:t>
-      </w:r>
-    </w:p>
-    <w:tbl>
-      <w:tblPr>
-        <w:tblW w:type="auto" w:w="0"/>
-        <w:tblLayout w:type="fixed"/>
-        <w:tblLook w:firstColumn="1" w:firstRow="1" w:lastColumn="0" w:lastRow="0" w:noHBand="0" w:noVBand="1" w:val="04A0"/>
-      </w:tblPr>
-      <w:tblGrid>
-        <w:gridCol w:w="2376"/>
-        <w:gridCol w:w="7776"/>
-      </w:tblGrid>
-      <w:tr>
-        <w:tc>
-          <w:tcPr>
-            <w:tcW w:type="dxa" w:w="2376"/>
-            <w:shd w:fill="567D35"/>
+            <w:tcW w:type="dxa" w:w="3324"/>
             <w:vAlign w:val="center"/>
-            <w:tcMar>
-              <w:top w:w="100" w:type="dxa"/>
-              <w:start w:w="120" w:type="dxa"/>
-              <w:bottom w:w="100" w:type="dxa"/>
-              <w:end w:w="120" w:type="dxa"/>
-            </w:tcMar>
-          </w:tcPr>
-          <w:p>
-            <w:r>
-              <w:rPr>
-                <w:b/>
-                <w:color w:val="FFFFFF"/>
-              </w:rPr>
-              <w:t>simulation.py</w:t>
-            </w:r>
-          </w:p>
-        </w:tc>
-        <w:tc>
-          <w:tcPr>
-            <w:tcW w:type="dxa" w:w="7776"/>
-            <w:shd w:fill="F5F7F5"/>
-            <w:vAlign w:val="center"/>
-            <w:tcMar>
-              <w:top w:w="100" w:type="dxa"/>
-              <w:start w:w="120" w:type="dxa"/>
-              <w:bottom w:w="100" w:type="dxa"/>
-              <w:end w:w="120" w:type="dxa"/>
-            </w:tcMar>
-          </w:tcPr>
-          <w:p>
-            <w:r>
-              <w:t>Generadores, combate, Monte Carlo e inferencia pareada</w:t>
-            </w:r>
-          </w:p>
-        </w:tc>
-      </w:tr>
-      <w:tr>
-        <w:tc>
-          <w:tcPr>
-            <w:tcW w:type="dxa" w:w="2376"/>
-            <w:shd w:fill="0B100D"/>
-            <w:vAlign w:val="center"/>
-            <w:tcMar>
-              <w:top w:w="100" w:type="dxa"/>
-              <w:start w:w="120" w:type="dxa"/>
-              <w:bottom w:w="100" w:type="dxa"/>
-              <w:end w:w="120" w:type="dxa"/>
-            </w:tcMar>
-          </w:tcPr>
-          <w:p>
-            <w:r>
-              <w:rPr>
-                <w:b/>
-                <w:color w:val="FFFFFF"/>
-              </w:rPr>
-              <w:t>visuals.py</w:t>
-            </w:r>
-          </w:p>
-        </w:tc>
-        <w:tc>
-          <w:tcPr>
-            <w:tcW w:type="dxa" w:w="7776"/>
-            <w:shd w:fill="E9EFEB"/>
-            <w:vAlign w:val="center"/>
-            <w:tcMar>
-              <w:top w:w="100" w:type="dxa"/>
-              <w:start w:w="120" w:type="dxa"/>
-              <w:bottom w:w="100" w:type="dxa"/>
-              <w:end w:w="120" w:type="dxa"/>
-            </w:tcMar>
-          </w:tcPr>
-          <w:p>
-            <w:r>
-              <w:t>Escena 3D, histogramas, Q-Q y gráficos comparativos</w:t>
-            </w:r>
-          </w:p>
-        </w:tc>
-      </w:tr>
-      <w:tr>
-        <w:tc>
-          <w:tcPr>
-            <w:tcW w:type="dxa" w:w="2376"/>
-            <w:shd w:fill="567D35"/>
-            <w:vAlign w:val="center"/>
-            <w:tcMar>
-              <w:top w:w="100" w:type="dxa"/>
-              <w:start w:w="120" w:type="dxa"/>
-              <w:bottom w:w="100" w:type="dxa"/>
-              <w:end w:w="120" w:type="dxa"/>
-            </w:tcMar>
-          </w:tcPr>
-          <w:p>
-            <w:r>
-              <w:rPr>
-                <w:b/>
-                <w:color w:val="FFFFFF"/>
-              </w:rPr>
-              <w:t>app.py</w:t>
-            </w:r>
-          </w:p>
-        </w:tc>
-        <w:tc>
-          <w:tcPr>
-            <w:tcW w:type="dxa" w:w="7776"/>
-            <w:shd w:fill="F5F7F5"/>
-            <w:vAlign w:val="center"/>
-            <w:tcMar>
-              <w:top w:w="100" w:type="dxa"/>
-              <w:start w:w="120" w:type="dxa"/>
-              <w:bottom w:w="100" w:type="dxa"/>
-              <w:end w:w="120" w:type="dxa"/>
-            </w:tcMar>
-          </w:tcPr>
-          <w:p>
-            <w:r>
-              <w:t>Formulario, estado, caché, navegación y explicación</w:t>
-            </w:r>
-          </w:p>
-        </w:tc>
-      </w:tr>
-      <w:tr>
-        <w:tc>
-          <w:tcPr>
-            <w:tcW w:type="dxa" w:w="2376"/>
-            <w:shd w:fill="0B100D"/>
-            <w:vAlign w:val="center"/>
-            <w:tcMar>
-              <w:top w:w="100" w:type="dxa"/>
-              <w:start w:w="120" w:type="dxa"/>
-              <w:bottom w:w="100" w:type="dxa"/>
-              <w:end w:w="120" w:type="dxa"/>
-            </w:tcMar>
-          </w:tcPr>
-          <w:p>
-            <w:r>
-              <w:rPr>
-                <w:b/>
-                <w:color w:val="FFFFFF"/>
-              </w:rPr>
-              <w:t>generate_report_assets.py</w:t>
-            </w:r>
-          </w:p>
-        </w:tc>
-        <w:tc>
-          <w:tcPr>
-            <w:tcW w:type="dxa" w:w="7776"/>
-            <w:shd w:fill="E9EFEB"/>
-            <w:vAlign w:val="center"/>
-            <w:tcMar>
-              <w:top w:w="100" w:type="dxa"/>
-              <w:start w:w="120" w:type="dxa"/>
-              <w:bottom w:w="100" w:type="dxa"/>
-              <w:end w:w="120" w:type="dxa"/>
-            </w:tcMar>
-          </w:tcPr>
-          <w:p>
-            <w:r>
-              <w:t>Regeneración de CSV, figuras y macros LaTeX</w:t>
-            </w:r>
-          </w:p>
-        </w:tc>
-      </w:tr>
-      <w:tr>
-        <w:tc>
-          <w:tcPr>
-            <w:tcW w:type="dxa" w:w="2376"/>
-            <w:shd w:fill="567D35"/>
-            <w:vAlign w:val="center"/>
-            <w:tcMar>
-              <w:top w:w="100" w:type="dxa"/>
-              <w:start w:w="120" w:type="dxa"/>
-              <w:bottom w:w="100" w:type="dxa"/>
-              <w:end w:w="120" w:type="dxa"/>
-            </w:tcMar>
-          </w:tcPr>
-          <w:p>
-            <w:r>
-              <w:rPr>
-                <w:b/>
-                <w:color w:val="FFFFFF"/>
-              </w:rPr>
-              <w:t>test_simulation.py</w:t>
-            </w:r>
-          </w:p>
-        </w:tc>
-        <w:tc>
-          <w:tcPr>
-            <w:tcW w:type="dxa" w:w="7776"/>
-            <w:shd w:fill="F5F7F5"/>
-            <w:vAlign w:val="center"/>
-            <w:tcMar>
-              <w:top w:w="100" w:type="dxa"/>
-              <w:start w:w="120" w:type="dxa"/>
-              <w:bottom w:w="100" w:type="dxa"/>
-              <w:end w:w="120" w:type="dxa"/>
-            </w:tcMar>
-          </w:tcPr>
-          <w:p>
-            <w:r>
-              <w:t>Doce pruebas deterministas y estadísticas</w:t>
-            </w:r>
-          </w:p>
-        </w:tc>
-      </w:tr>
-    </w:tbl>
-    <w:p>
-      <w:pPr>
-        <w:pStyle w:val="Heading2"/>
-      </w:pPr>
-      <w:r>
-        <w:t>Inicio rápido</w:t>
-      </w:r>
-    </w:p>
-    <w:tbl>
-      <w:tblPr>
-        <w:tblW w:type="auto" w:w="0"/>
-        <w:tblLook w:firstColumn="1" w:firstRow="1" w:lastColumn="0" w:lastRow="0" w:noHBand="0" w:noVBand="1" w:val="04A0"/>
-      </w:tblPr>
-      <w:tblGrid>
-        <w:gridCol w:w="10166"/>
-      </w:tblGrid>
-      <w:tr>
-        <w:tc>
-          <w:tcPr>
-            <w:tcW w:type="dxa" w:w="10166"/>
-            <w:shd w:fill="0B100D"/>
-            <w:tcMar>
-              <w:top w:w="140" w:type="dxa"/>
-              <w:start w:w="180" w:type="dxa"/>
-              <w:bottom w:w="140" w:type="dxa"/>
-              <w:end w:w="180" w:type="dxa"/>
-            </w:tcMar>
-          </w:tcPr>
-          <w:p>
-            <w:pPr>
-              <w:spacing w:after="0"/>
-            </w:pPr>
-            <w:r>
-              <w:rPr>
-                <w:rFonts w:ascii="Consolas" w:hAnsi="Consolas"/>
-                <w:color w:val="B8F36B"/>
-                <w:sz w:val="18"/>
-              </w:rPr>
-              <w:t>git clone https://github.com/DanielBarillasM/Proyecto-1_Grupo-1_Modelacion-y-Simulacion_Sec-30.git</w:t>
-              <w:br/>
-            </w:r>
-            <w:r>
-              <w:rPr>
-                <w:rFonts w:ascii="Consolas" w:hAnsi="Consolas"/>
-                <w:color w:val="B8F36B"/>
-                <w:sz w:val="18"/>
-              </w:rPr>
-              <w:t>cd Proyecto-1_Grupo-1_Modelacion-y-Simulacion_Sec-30/zombie_poisson_streamlit</w:t>
-              <w:br/>
-            </w:r>
-            <w:r>
-              <w:rPr>
-                <w:rFonts w:ascii="Consolas" w:hAnsi="Consolas"/>
-                <w:color w:val="B8F36B"/>
-                <w:sz w:val="18"/>
-              </w:rPr>
-              <w:t>python -m pip install -r requirements/requirements.txt</w:t>
-              <w:br/>
-            </w:r>
-            <w:r>
-              <w:rPr>
-                <w:rFonts w:ascii="Consolas" w:hAnsi="Consolas"/>
-                <w:color w:val="B8F36B"/>
-                <w:sz w:val="18"/>
-              </w:rPr>
-              <w:t>python -m streamlit run App/app.py</w:t>
-            </w:r>
-          </w:p>
-        </w:tc>
-      </w:tr>
-    </w:tbl>
-    <w:p>
-      <w:r>
-        <w:t>Flujo recomendado dentro de la aplicación:</w:t>
-      </w:r>
-    </w:p>
-    <w:p>
-      <w:pPr>
-        <w:pStyle w:val="ListBullet"/>
-        <w:spacing w:after="60"/>
-      </w:pPr>
-      <w:r>
-        <w:t>Configurar el escenario y pulsar SIMULAR MISIÓN.</w:t>
-      </w:r>
-    </w:p>
-    <w:p>
-      <w:pPr>
-        <w:pStyle w:val="ListBullet"/>
-        <w:spacing w:after="60"/>
-      </w:pPr>
-      <w:r>
-        <w:t>Recorrer el tiempo de la escena 3D y observar la telemetría.</w:t>
-      </w:r>
-    </w:p>
-    <w:p>
-      <w:pPr>
-        <w:pStyle w:val="ListBullet"/>
-        <w:spacing w:after="60"/>
-      </w:pPr>
-      <w:r>
-        <w:t>Ejecutar la validación formal de los generadores.</w:t>
-      </w:r>
-    </w:p>
-    <w:p>
-      <w:pPr>
-        <w:pStyle w:val="ListBullet"/>
-        <w:spacing w:after="60"/>
-      </w:pPr>
-      <w:r>
-        <w:t>Ejecutar la comparación Poisson vs. Polar y revisar efectos pareados.</w:t>
-      </w:r>
-    </w:p>
-    <w:p>
-      <w:pPr>
-        <w:pStyle w:val="ListBullet"/>
-        <w:spacing w:after="60"/>
-      </w:pPr>
-      <w:r>
-        <w:t>Explorar el laboratorio Monte Carlo y la sensibilidad a la tasa.</w:t>
-      </w:r>
-    </w:p>
-    <w:p>
-      <w:r>
-        <w:br w:type="page"/>
-      </w:r>
-    </w:p>
-    <w:tbl>
-      <w:tblPr>
-        <w:tblW w:type="auto" w:w="0"/>
-        <w:tblLayout w:type="autofit"/>
-        <w:tblLook w:firstColumn="1" w:firstRow="1" w:lastColumn="0" w:lastRow="0" w:noHBand="0" w:noVBand="1" w:val="04A0"/>
-      </w:tblPr>
-      <w:tblGrid>
-        <w:gridCol w:w="10166"/>
-      </w:tblGrid>
-      <w:tr>
-        <w:tc>
-          <w:tcPr>
-            <w:tcW w:type="dxa" w:w="10166"/>
-            <w:shd w:fill="567D35"/>
-            <w:tcMar>
-              <w:top w:w="80" w:type="dxa"/>
-              <w:start w:w="150" w:type="dxa"/>
-              <w:bottom w:w="80" w:type="dxa"/>
-              <w:end w:w="150" w:type="dxa"/>
-            </w:tcMar>
-          </w:tcPr>
-          <w:p>
-            <w:pPr>
-              <w:spacing w:after="0"/>
-            </w:pPr>
-            <w:r>
-              <w:rPr>
-                <w:b/>
-                <w:color w:val="FFFFFF"/>
-                <w:sz w:val="18"/>
-              </w:rPr>
-              <w:t>4 · VALIDACIÓN Y RESULTADOS</w:t>
-            </w:r>
-          </w:p>
-        </w:tc>
-      </w:tr>
-    </w:tbl>
-    <w:p>
-      <w:pPr>
-        <w:pStyle w:val="Heading1"/>
-      </w:pPr>
-      <w:r>
-        <w:t>Evidencia estadística reproducible</w:t>
-      </w:r>
-    </w:p>
-    <w:p>
-      <w:pPr>
-        <w:jc w:val="center"/>
-      </w:pPr>
-      <w:r>
-        <w:drawing>
-          <wp:inline xmlns:a="http://schemas.openxmlformats.org/drawingml/2006/main" xmlns:pic="http://schemas.openxmlformats.org/drawingml/2006/picture">
-            <wp:extent cx="5806440" cy="3536338"/>
-            <wp:docPr id="3" name="Picture 3"/>
-            <wp:cNvGraphicFramePr>
-              <a:graphicFrameLocks noChangeAspect="1"/>
-            </wp:cNvGraphicFramePr>
-            <a:graphic>
-              <a:graphicData uri="http://schemas.openxmlformats.org/drawingml/2006/picture">
-                <pic:pic>
-                  <pic:nvPicPr>
-                    <pic:cNvPr id="0" name="report-generator-validation.png"/>
-                    <pic:cNvPicPr/>
-                  </pic:nvPicPr>
-                  <pic:blipFill>
-                    <a:blip r:embed="rId14"/>
-                    <a:stretch>
-                      <a:fillRect/>
-                    </a:stretch>
-                  </pic:blipFill>
-                  <pic:spPr>
-                    <a:xfrm>
-                      <a:off x="0" y="0"/>
-                      <a:ext cx="5806440" cy="3536338"/>
-                    </a:xfrm>
-                    <a:prstGeom prst="rect"/>
-                  </pic:spPr>
-                </pic:pic>
-              </a:graphicData>
-            </a:graphic>
-          </wp:inline>
-        </w:drawing>
-      </w:r>
-    </w:p>
-    <w:p>
-      <w:r>
-        <w:t>La validación usa muestras fijas sin censura. Incluye KS para exponencial, normal y lognormal; correlación de rezago uno; dispersión de conteos; aceptación Polar contra π/4; momentos y benchmark. No rechazar indica compatibilidad con el modelo, no una prueba absoluta de verdad.</w:t>
-      </w:r>
-    </w:p>
-    <w:p>
-      <w:pPr>
-        <w:pStyle w:val="Heading2"/>
-      </w:pPr>
-      <w:r>
-        <w:t>Escenario base: 400 partidas por modelo</w:t>
-      </w:r>
-    </w:p>
-    <w:tbl>
-      <w:tblPr>
-        <w:tblW w:type="auto" w:w="0"/>
-        <w:tblLook w:firstColumn="1" w:firstRow="1" w:lastColumn="0" w:lastRow="0" w:noHBand="0" w:noVBand="1" w:val="04A0"/>
-      </w:tblPr>
-      <w:tblGrid>
-        <w:gridCol w:w="3389"/>
-        <w:gridCol w:w="3389"/>
-        <w:gridCol w:w="3389"/>
-      </w:tblGrid>
-      <w:tr>
-        <w:tc>
-          <w:tcPr>
-            <w:tcW w:type="dxa" w:w="3389"/>
-            <w:shd w:fill="0B100D"/>
-          </w:tcPr>
-          <w:p>
-            <w:r>
-              <w:rPr>
-                <w:b/>
-                <w:color w:val="B8F36B"/>
-              </w:rPr>
-              <w:t>Métrica</w:t>
-            </w:r>
-          </w:p>
-        </w:tc>
-        <w:tc>
-          <w:tcPr>
-            <w:tcW w:type="dxa" w:w="3389"/>
-            <w:shd w:fill="0B100D"/>
-          </w:tcPr>
-          <w:p>
-            <w:r>
-              <w:rPr>
-                <w:b/>
-                <w:color w:val="B8F36B"/>
-              </w:rPr>
-              <w:t>Poisson</w:t>
-            </w:r>
-          </w:p>
-        </w:tc>
-        <w:tc>
-          <w:tcPr>
-            <w:tcW w:type="dxa" w:w="3389"/>
-            <w:shd w:fill="0B100D"/>
-          </w:tcPr>
-          <w:p>
-            <w:r>
-              <w:rPr>
-                <w:b/>
-                <w:color w:val="B8F36B"/>
-              </w:rPr>
-              <w:t>Polar-lognormal</w:t>
-            </w:r>
-          </w:p>
-        </w:tc>
-      </w:tr>
-      <w:tr>
-        <w:tc>
-          <w:tcPr>
-            <w:tcW w:type="dxa" w:w="3389"/>
-            <w:shd w:fill="F4F7F4"/>
-            <w:tcMar>
-              <w:top w:w="100" w:type="dxa"/>
-              <w:start w:w="120" w:type="dxa"/>
-              <w:bottom w:w="100" w:type="dxa"/>
-              <w:end w:w="120" w:type="dxa"/>
-            </w:tcMar>
           </w:tcPr>
           <w:p>
             <w:r>
@@ -1880,35 +924,23 @@
         </w:tc>
         <w:tc>
           <w:tcPr>
-            <w:tcW w:type="dxa" w:w="3389"/>
-            <w:shd w:fill="F4F7F4"/>
-            <w:tcMar>
-              <w:top w:w="100" w:type="dxa"/>
-              <w:start w:w="120" w:type="dxa"/>
-              <w:bottom w:w="100" w:type="dxa"/>
-              <w:end w:w="120" w:type="dxa"/>
-            </w:tcMar>
+            <w:tcW w:type="dxa" w:w="3324"/>
+            <w:vAlign w:val="center"/>
           </w:tcPr>
           <w:p>
             <w:r>
-              <w:t>96.5 %</w:t>
+              <w:t>35.2 %</w:t>
             </w:r>
           </w:p>
         </w:tc>
         <w:tc>
           <w:tcPr>
-            <w:tcW w:type="dxa" w:w="3389"/>
-            <w:shd w:fill="F4F7F4"/>
-            <w:tcMar>
-              <w:top w:w="100" w:type="dxa"/>
-              <w:start w:w="120" w:type="dxa"/>
-              <w:bottom w:w="100" w:type="dxa"/>
-              <w:end w:w="120" w:type="dxa"/>
-            </w:tcMar>
+            <w:tcW w:type="dxa" w:w="3324"/>
+            <w:vAlign w:val="center"/>
           </w:tcPr>
           <w:p>
             <w:r>
-              <w:t>100.0 %</w:t>
+              <w:t>77.8 %</w:t>
             </w:r>
           </w:p>
         </w:tc>
@@ -1916,14 +948,8 @@
       <w:tr>
         <w:tc>
           <w:tcPr>
-            <w:tcW w:type="dxa" w:w="3389"/>
-            <w:shd w:fill="E8EFEA"/>
-            <w:tcMar>
-              <w:top w:w="100" w:type="dxa"/>
-              <w:start w:w="120" w:type="dxa"/>
-              <w:bottom w:w="100" w:type="dxa"/>
-              <w:end w:w="120" w:type="dxa"/>
-            </w:tcMar>
+            <w:tcW w:type="dxa" w:w="3324"/>
+            <w:vAlign w:val="center"/>
           </w:tcPr>
           <w:p>
             <w:r>
@@ -1933,35 +959,23 @@
         </w:tc>
         <w:tc>
           <w:tcPr>
-            <w:tcW w:type="dxa" w:w="3389"/>
-            <w:shd w:fill="E8EFEA"/>
-            <w:tcMar>
-              <w:top w:w="100" w:type="dxa"/>
-              <w:start w:w="120" w:type="dxa"/>
-              <w:bottom w:w="100" w:type="dxa"/>
-              <w:end w:w="120" w:type="dxa"/>
-            </w:tcMar>
+            <w:tcW w:type="dxa" w:w="3324"/>
+            <w:vAlign w:val="center"/>
           </w:tcPr>
           <w:p>
             <w:r>
-              <w:t>[94.2, 97.9] %</w:t>
+              <w:t>[30.7, 40.1] %</w:t>
             </w:r>
           </w:p>
         </w:tc>
         <w:tc>
           <w:tcPr>
-            <w:tcW w:type="dxa" w:w="3389"/>
-            <w:shd w:fill="E8EFEA"/>
-            <w:tcMar>
-              <w:top w:w="100" w:type="dxa"/>
-              <w:start w:w="120" w:type="dxa"/>
-              <w:bottom w:w="100" w:type="dxa"/>
-              <w:end w:w="120" w:type="dxa"/>
-            </w:tcMar>
+            <w:tcW w:type="dxa" w:w="3324"/>
+            <w:vAlign w:val="center"/>
           </w:tcPr>
           <w:p>
             <w:r>
-              <w:t>[99.0, 100.0] %</w:t>
+              <w:t>[73.4, 81.6] %</w:t>
             </w:r>
           </w:p>
         </w:tc>
@@ -1969,14 +983,8 @@
       <w:tr>
         <w:tc>
           <w:tcPr>
-            <w:tcW w:type="dxa" w:w="3389"/>
-            <w:shd w:fill="F4F7F4"/>
-            <w:tcMar>
-              <w:top w:w="100" w:type="dxa"/>
-              <w:start w:w="120" w:type="dxa"/>
-              <w:bottom w:w="100" w:type="dxa"/>
-              <w:end w:w="120" w:type="dxa"/>
-            </w:tcMar>
+            <w:tcW w:type="dxa" w:w="3324"/>
+            <w:vAlign w:val="center"/>
           </w:tcPr>
           <w:p>
             <w:r>
@@ -1986,35 +994,23 @@
         </w:tc>
         <w:tc>
           <w:tcPr>
-            <w:tcW w:type="dxa" w:w="3389"/>
-            <w:shd w:fill="F4F7F4"/>
-            <w:tcMar>
-              <w:top w:w="100" w:type="dxa"/>
-              <w:start w:w="120" w:type="dxa"/>
-              <w:bottom w:w="100" w:type="dxa"/>
-              <w:end w:w="120" w:type="dxa"/>
-            </w:tcMar>
+            <w:tcW w:type="dxa" w:w="3324"/>
+            <w:vAlign w:val="center"/>
           </w:tcPr>
           <w:p>
             <w:r>
-              <w:t>88.528 s</w:t>
+              <w:t>64.694 s</w:t>
             </w:r>
           </w:p>
         </w:tc>
         <w:tc>
           <w:tcPr>
-            <w:tcW w:type="dxa" w:w="3389"/>
-            <w:shd w:fill="F4F7F4"/>
-            <w:tcMar>
-              <w:top w:w="100" w:type="dxa"/>
-              <w:start w:w="120" w:type="dxa"/>
-              <w:bottom w:w="100" w:type="dxa"/>
-              <w:end w:w="120" w:type="dxa"/>
-            </w:tcMar>
+            <w:tcW w:type="dxa" w:w="3324"/>
+            <w:vAlign w:val="center"/>
           </w:tcPr>
           <w:p>
             <w:r>
-              <w:t>90.000 s</w:t>
+              <w:t>83.666 s</w:t>
             </w:r>
           </w:p>
         </w:tc>
@@ -2022,52 +1018,104 @@
       <w:tr>
         <w:tc>
           <w:tcPr>
-            <w:tcW w:type="dxa" w:w="3389"/>
-            <w:shd w:fill="E8EFEA"/>
-            <w:tcMar>
-              <w:top w:w="100" w:type="dxa"/>
-              <w:start w:w="120" w:type="dxa"/>
-              <w:bottom w:w="100" w:type="dxa"/>
-              <w:end w:w="120" w:type="dxa"/>
-            </w:tcMar>
+            <w:tcW w:type="dxa" w:w="3324"/>
+            <w:vAlign w:val="center"/>
           </w:tcPr>
           <w:p>
             <w:r>
-              <w:t>Llegadas medias</w:t>
+              <w:t>Pico activo medio</w:t>
             </w:r>
           </w:p>
         </w:tc>
         <w:tc>
           <w:tcPr>
-            <w:tcW w:type="dxa" w:w="3389"/>
-            <w:shd w:fill="E8EFEA"/>
-            <w:tcMar>
-              <w:top w:w="100" w:type="dxa"/>
-              <w:start w:w="120" w:type="dxa"/>
-              <w:bottom w:w="100" w:type="dxa"/>
-              <w:end w:w="120" w:type="dxa"/>
-            </w:tcMar>
+            <w:tcW w:type="dxa" w:w="3324"/>
+            <w:vAlign w:val="center"/>
           </w:tcPr>
           <w:p>
             <w:r>
-              <w:t>57.133</w:t>
+              <w:t>14.220</w:t>
             </w:r>
           </w:p>
         </w:tc>
         <w:tc>
           <w:tcPr>
-            <w:tcW w:type="dxa" w:w="3389"/>
-            <w:shd w:fill="E8EFEA"/>
-            <w:tcMar>
-              <w:top w:w="100" w:type="dxa"/>
-              <w:start w:w="120" w:type="dxa"/>
-              <w:bottom w:w="100" w:type="dxa"/>
-              <w:end w:w="120" w:type="dxa"/>
-            </w:tcMar>
+            <w:tcW w:type="dxa" w:w="3324"/>
+            <w:vAlign w:val="center"/>
           </w:tcPr>
           <w:p>
             <w:r>
-              <w:t>57.778</w:t>
+              <w:t>11.225</w:t>
+            </w:r>
+          </w:p>
+        </w:tc>
+      </w:tr>
+    </w:tbl>
+    <w:p/>
+    <w:p>
+      <w:r>
+        <w:t>Efecto Poisson menos Polar: -42.5 puntos porcentuales, IC [-48.8, -35.8]. La conclusión es condicional al escenario; mayor supervivencia no equivale a mejor modelo.</w:t>
+      </w:r>
+    </w:p>
+    <w:p>
+      <w:pPr>
+        <w:sectPr>
+          <w:pgSz w:w="12240" w:h="15840"/>
+          <w:pgMar w:top="1020" w:right="1134" w:bottom="964" w:left="1134" w:header="720" w:footer="720" w:gutter="0"/>
+          <w:cols w:space="720"/>
+          <w:docGrid w:linePitch="360"/>
+        </w:sectPr>
+      </w:pPr>
+    </w:p>
+    <w:p>
+      <w:pPr>
+        <w:pStyle w:val="Heading1"/>
+      </w:pPr>
+      <w:r>
+        <w:t>5. Arquitectura, uso y entregables</w:t>
+      </w:r>
+    </w:p>
+    <w:tbl>
+      <w:tblPr>
+        <w:tblStyle w:val="LightShading-Accent1"/>
+        <w:tblW w:type="auto" w:w="0"/>
+        <w:jc w:val="center"/>
+        <w:tblLook w:firstColumn="1" w:firstRow="1" w:lastColumn="0" w:lastRow="0" w:noHBand="0" w:noVBand="1" w:val="04A0"/>
+      </w:tblPr>
+      <w:tblGrid>
+        <w:gridCol w:w="4986"/>
+        <w:gridCol w:w="4986"/>
+      </w:tblGrid>
+      <w:tr>
+        <w:tc>
+          <w:tcPr>
+            <w:tcW w:type="dxa" w:w="4986"/>
+            <w:shd w:fill="0B100D"/>
+            <w:vAlign w:val="center"/>
+          </w:tcPr>
+          <w:p>
+            <w:r>
+              <w:rPr>
+                <w:b/>
+                <w:color w:val="9FE870"/>
+              </w:rPr>
+              <w:t>Ruta</w:t>
+            </w:r>
+          </w:p>
+        </w:tc>
+        <w:tc>
+          <w:tcPr>
+            <w:tcW w:type="dxa" w:w="4986"/>
+            <w:shd w:fill="0B100D"/>
+            <w:vAlign w:val="center"/>
+          </w:tcPr>
+          <w:p>
+            <w:r>
+              <w:rPr>
+                <w:b/>
+                <w:color w:val="9FE870"/>
+              </w:rPr>
+              <w:t>Responsabilidad</w:t>
             </w:r>
           </w:p>
         </w:tc>
@@ -2075,213 +1123,191 @@
       <w:tr>
         <w:tc>
           <w:tcPr>
-            <w:tcW w:type="dxa" w:w="3389"/>
-            <w:shd w:fill="F4F7F4"/>
-            <w:tcMar>
-              <w:top w:w="100" w:type="dxa"/>
-              <w:start w:w="120" w:type="dxa"/>
-              <w:bottom w:w="100" w:type="dxa"/>
-              <w:end w:w="120" w:type="dxa"/>
-            </w:tcMar>
+            <w:tcW w:type="dxa" w:w="4986"/>
+            <w:vAlign w:val="center"/>
           </w:tcPr>
           <w:p>
             <w:r>
-              <w:t>Pico concurrente</w:t>
+              <w:t>App/simulation.py</w:t>
             </w:r>
           </w:p>
         </w:tc>
         <w:tc>
           <w:tcPr>
-            <w:tcW w:type="dxa" w:w="3389"/>
-            <w:shd w:fill="F4F7F4"/>
-            <w:tcMar>
-              <w:top w:w="100" w:type="dxa"/>
-              <w:start w:w="120" w:type="dxa"/>
-              <w:bottom w:w="100" w:type="dxa"/>
-              <w:end w:w="120" w:type="dxa"/>
-            </w:tcMar>
+            <w:tcW w:type="dxa" w:w="4986"/>
+            <w:vAlign w:val="center"/>
           </w:tcPr>
           <w:p>
             <w:r>
-              <w:t>9.483</w:t>
+              <w:t>Motor, generadores, validación e inferencia</w:t>
+            </w:r>
+          </w:p>
+        </w:tc>
+      </w:tr>
+      <w:tr>
+        <w:tc>
+          <w:tcPr>
+            <w:tcW w:type="dxa" w:w="4986"/>
+            <w:vAlign w:val="center"/>
+          </w:tcPr>
+          <w:p>
+            <w:r>
+              <w:t>App/visuals.py</w:t>
             </w:r>
           </w:p>
         </w:tc>
         <w:tc>
           <w:tcPr>
-            <w:tcW w:type="dxa" w:w="3389"/>
-            <w:shd w:fill="F4F7F4"/>
-            <w:tcMar>
-              <w:top w:w="100" w:type="dxa"/>
-              <w:start w:w="120" w:type="dxa"/>
-              <w:bottom w:w="100" w:type="dxa"/>
-              <w:end w:w="120" w:type="dxa"/>
-            </w:tcMar>
+            <w:tcW w:type="dxa" w:w="4986"/>
+            <w:vAlign w:val="center"/>
           </w:tcPr>
           <w:p>
             <w:r>
-              <w:t>6.483</w:t>
+              <w:t>Gráficas Plotly y escena 3D</w:t>
+            </w:r>
+          </w:p>
+        </w:tc>
+      </w:tr>
+      <w:tr>
+        <w:tc>
+          <w:tcPr>
+            <w:tcW w:type="dxa" w:w="4986"/>
+            <w:vAlign w:val="center"/>
+          </w:tcPr>
+          <w:p>
+            <w:r>
+              <w:t>App/app.py</w:t>
+            </w:r>
+          </w:p>
+        </w:tc>
+        <w:tc>
+          <w:tcPr>
+            <w:tcW w:type="dxa" w:w="4986"/>
+            <w:vAlign w:val="center"/>
+          </w:tcPr>
+          <w:p>
+            <w:r>
+              <w:t>Interfaz, estado, controles y caché</w:t>
+            </w:r>
+          </w:p>
+        </w:tc>
+      </w:tr>
+      <w:tr>
+        <w:tc>
+          <w:tcPr>
+            <w:tcW w:type="dxa" w:w="4986"/>
+            <w:vAlign w:val="center"/>
+          </w:tcPr>
+          <w:p>
+            <w:r>
+              <w:t>report/</w:t>
+            </w:r>
+          </w:p>
+        </w:tc>
+        <w:tc>
+          <w:tcPr>
+            <w:tcW w:type="dxa" w:w="4986"/>
+            <w:vAlign w:val="center"/>
+          </w:tcPr>
+          <w:p>
+            <w:r>
+              <w:t>Informe, CSV, figuras y generador reproducible</w:t>
+            </w:r>
+          </w:p>
+        </w:tc>
+      </w:tr>
+      <w:tr>
+        <w:tc>
+          <w:tcPr>
+            <w:tcW w:type="dxa" w:w="4986"/>
+            <w:vAlign w:val="center"/>
+          </w:tcPr>
+          <w:p>
+            <w:r>
+              <w:t>presentation/</w:t>
+            </w:r>
+          </w:p>
+        </w:tc>
+        <w:tc>
+          <w:tcPr>
+            <w:tcW w:type="dxa" w:w="4986"/>
+            <w:vAlign w:val="center"/>
+          </w:tcPr>
+          <w:p>
+            <w:r>
+              <w:t>Presentación HTML, ficha y guion por integrante</w:t>
+            </w:r>
+          </w:p>
+        </w:tc>
+      </w:tr>
+      <w:tr>
+        <w:tc>
+          <w:tcPr>
+            <w:tcW w:type="dxa" w:w="4986"/>
+            <w:vAlign w:val="center"/>
+          </w:tcPr>
+          <w:p>
+            <w:r>
+              <w:t>tests/</w:t>
+            </w:r>
+          </w:p>
+        </w:tc>
+        <w:tc>
+          <w:tcPr>
+            <w:tcW w:type="dxa" w:w="4986"/>
+            <w:vAlign w:val="center"/>
+          </w:tcPr>
+          <w:p>
+            <w:r>
+              <w:t>28 pruebas de regresión y propiedades</w:t>
             </w:r>
           </w:p>
         </w:tc>
       </w:tr>
     </w:tbl>
-    <w:tbl>
-      <w:tblPr>
-        <w:tblW w:type="auto" w:w="0"/>
-        <w:tblLook w:firstColumn="1" w:firstRow="1" w:lastColumn="0" w:lastRow="0" w:noHBand="0" w:noVBand="1" w:val="04A0"/>
-      </w:tblPr>
-      <w:tblGrid>
-        <w:gridCol w:w="10166"/>
-      </w:tblGrid>
-      <w:tr>
-        <w:tc>
-          <w:tcPr>
-            <w:tcW w:type="dxa" w:w="10166"/>
-            <w:shd w:fill="FFF5E7"/>
-            <w:tcMar>
-              <w:top w:w="150" w:type="dxa"/>
-              <w:start w:w="180" w:type="dxa"/>
-              <w:bottom w:w="150" w:type="dxa"/>
-              <w:end w:w="180" w:type="dxa"/>
-            </w:tcMar>
-          </w:tcPr>
-          <w:p>
-            <w:r>
-              <w:rPr>
-                <w:b/>
-                <w:color w:val="567D35"/>
-              </w:rPr>
-              <w:t xml:space="preserve">Lectura: </w:t>
-            </w:r>
-            <w:r>
-              <w:t>El efecto de supervivencia Poisson − Polar fue −3.5 puntos porcentuales, con IC bootstrap [−5.5, −1.8] y McNemar exacta p = 0.000122. Poisson produjo aproximadamente tres enemigos más en el pico concurrente.</w:t>
-            </w:r>
-          </w:p>
-        </w:tc>
-      </w:tr>
-    </w:tbl>
+    <w:p/>
     <w:p>
       <w:pPr>
-        <w:spacing w:after="0"/>
+        <w:pStyle w:val="Heading2"/>
       </w:pPr>
-    </w:p>
-    <w:p>
       <w:r>
-        <w:t>Poisson permanece como modelo principal por correspondencia con el conteo, parsimonia, costo e interpretación; no porque garantice mayor supervivencia. Sin telemetría real, la elección es condicional a los supuestos.</w:t>
+        <w:t>Inicio rápido</w:t>
       </w:r>
     </w:p>
     <w:p>
       <w:r>
-        <w:br w:type="page"/>
-      </w:r>
-    </w:p>
-    <w:tbl>
-      <w:tblPr>
-        <w:tblW w:type="auto" w:w="0"/>
-        <w:tblLayout w:type="autofit"/>
-        <w:tblLook w:firstColumn="1" w:firstRow="1" w:lastColumn="0" w:lastRow="0" w:noHBand="0" w:noVBand="1" w:val="04A0"/>
-      </w:tblPr>
-      <w:tblGrid>
-        <w:gridCol w:w="10166"/>
-      </w:tblGrid>
-      <w:tr>
-        <w:tc>
-          <w:tcPr>
-            <w:tcW w:type="dxa" w:w="10166"/>
-            <w:shd w:fill="567D35"/>
-            <w:tcMar>
-              <w:top w:w="80" w:type="dxa"/>
-              <w:start w:w="150" w:type="dxa"/>
-              <w:bottom w:w="80" w:type="dxa"/>
-              <w:end w:w="150" w:type="dxa"/>
-            </w:tcMar>
-          </w:tcPr>
-          <w:p>
-            <w:pPr>
-              <w:spacing w:after="0"/>
-            </w:pPr>
-            <w:r>
-              <w:rPr>
-                <w:b/>
-                <w:color w:val="FFFFFF"/>
-                <w:sz w:val="18"/>
-              </w:rPr>
-              <w:t>5 · ENTREGABLES, EQUIPO Y USO ACADÉMICO</w:t>
-            </w:r>
-          </w:p>
-        </w:tc>
-      </w:tr>
-    </w:tbl>
-    <w:p>
-      <w:pPr>
-        <w:pStyle w:val="Heading1"/>
-      </w:pPr>
-      <w:r>
-        <w:t>Material incluido</w:t>
+        <w:rPr>
+          <w:rFonts w:ascii="Consolas" w:hAnsi="Consolas"/>
+          <w:sz w:val="19"/>
+        </w:rPr>
+        <w:t>cd zombie_poisson_streamlit</w:t>
       </w:r>
     </w:p>
     <w:p>
-      <w:pPr>
-        <w:pStyle w:val="ListBullet"/>
-        <w:spacing w:after="60"/>
-      </w:pPr>
       <w:r>
-        <w:t>Aplicación funcional en Streamlit con escena 3D interactiva.</w:t>
+        <w:rPr>
+          <w:rFonts w:ascii="Consolas" w:hAnsi="Consolas"/>
+          <w:sz w:val="19"/>
+        </w:rPr>
+        <w:t>python -m venv .venv</w:t>
       </w:r>
     </w:p>
     <w:p>
-      <w:pPr>
-        <w:pStyle w:val="ListBullet"/>
-        <w:spacing w:after="60"/>
-      </w:pPr>
       <w:r>
-        <w:t>README con instalación, teoría, arquitectura y uso.</w:t>
+        <w:rPr>
+          <w:rFonts w:ascii="Consolas" w:hAnsi="Consolas"/>
+          <w:sz w:val="19"/>
+        </w:rPr>
+        <w:t>python -m pip install -r requirements/requirements.txt</w:t>
       </w:r>
     </w:p>
     <w:p>
-      <w:pPr>
-        <w:pStyle w:val="ListBullet"/>
-        <w:spacing w:after="60"/>
-      </w:pPr>
       <w:r>
-        <w:t>Informe LaTeX compilado a PDF con resultados reproducibles.</w:t>
-      </w:r>
-    </w:p>
-    <w:p>
-      <w:pPr>
-        <w:pStyle w:val="ListBullet"/>
-        <w:spacing w:after="60"/>
-      </w:pPr>
-      <w:r>
-        <w:t>Presentación HTML de 25 diapositivas, operativa sin conexión.</w:t>
-      </w:r>
-    </w:p>
-    <w:p>
-      <w:pPr>
-        <w:pStyle w:val="ListBullet"/>
-        <w:spacing w:after="60"/>
-      </w:pPr>
-      <w:r>
-        <w:t>Guion LaTeX dividido entre los cuatro integrantes.</w:t>
-      </w:r>
-    </w:p>
-    <w:p>
-      <w:pPr>
-        <w:pStyle w:val="ListBullet"/>
-        <w:spacing w:after="60"/>
-      </w:pPr>
-      <w:r>
-        <w:t>CSV y figuras regenerables para auditoría.</w:t>
-      </w:r>
-    </w:p>
-    <w:p>
-      <w:pPr>
-        <w:pStyle w:val="ListBullet"/>
-        <w:spacing w:after="60"/>
-      </w:pPr>
-      <w:r>
-        <w:t>Doce pruebas automatizadas del motor y la estadística.</w:t>
+        <w:rPr>
+          <w:rFonts w:ascii="Consolas" w:hAnsi="Consolas"/>
+          <w:sz w:val="19"/>
+        </w:rPr>
+        <w:t>python -m streamlit run App/app.py</w:t>
       </w:r>
     </w:p>
     <w:p>
@@ -2289,285 +1315,60 @@
         <w:pStyle w:val="Heading2"/>
       </w:pPr>
       <w:r>
-        <w:t>Integrantes y reparto sugerido</w:t>
+        <w:t>Entregables</w:t>
       </w:r>
     </w:p>
-    <w:tbl>
-      <w:tblPr>
-        <w:tblW w:type="auto" w:w="0"/>
-        <w:tblLook w:firstColumn="1" w:firstRow="1" w:lastColumn="0" w:lastRow="0" w:noHBand="0" w:noVBand="1" w:val="04A0"/>
-      </w:tblPr>
-      <w:tblGrid>
-        <w:gridCol w:w="3389"/>
-        <w:gridCol w:w="3389"/>
-        <w:gridCol w:w="3389"/>
-      </w:tblGrid>
-      <w:tr>
-        <w:tc>
-          <w:tcPr>
-            <w:tcW w:type="dxa" w:w="3389"/>
-            <w:shd w:fill="0B100D"/>
-          </w:tcPr>
-          <w:p>
-            <w:r>
-              <w:rPr>
-                <w:b/>
-                <w:color w:val="B8F36B"/>
-              </w:rPr>
-              <w:t>Integrante</w:t>
-            </w:r>
-          </w:p>
-        </w:tc>
-        <w:tc>
-          <w:tcPr>
-            <w:tcW w:type="dxa" w:w="3389"/>
-            <w:shd w:fill="0B100D"/>
-          </w:tcPr>
-          <w:p>
-            <w:r>
-              <w:rPr>
-                <w:b/>
-                <w:color w:val="B8F36B"/>
-              </w:rPr>
-              <w:t>Diapositivas</w:t>
-            </w:r>
-          </w:p>
-        </w:tc>
-        <w:tc>
-          <w:tcPr>
-            <w:tcW w:type="dxa" w:w="3389"/>
-            <w:shd w:fill="0B100D"/>
-          </w:tcPr>
-          <w:p>
-            <w:r>
-              <w:rPr>
-                <w:b/>
-                <w:color w:val="B8F36B"/>
-              </w:rPr>
-              <w:t>Tema</w:t>
-            </w:r>
-          </w:p>
-        </w:tc>
-      </w:tr>
-      <w:tr>
-        <w:tc>
-          <w:tcPr>
-            <w:tcW w:type="dxa" w:w="3389"/>
-            <w:shd w:fill="F4F7F4"/>
-            <w:tcMar>
-              <w:top w:w="100" w:type="dxa"/>
-              <w:start w:w="120" w:type="dxa"/>
-              <w:bottom w:w="100" w:type="dxa"/>
-              <w:end w:w="120" w:type="dxa"/>
-            </w:tcMar>
-          </w:tcPr>
-          <w:p>
-            <w:r>
-              <w:t>Pablo Daniel Barillas Moreno</w:t>
-            </w:r>
-          </w:p>
-        </w:tc>
-        <w:tc>
-          <w:tcPr>
-            <w:tcW w:type="dxa" w:w="3389"/>
-            <w:shd w:fill="F4F7F4"/>
-            <w:tcMar>
-              <w:top w:w="100" w:type="dxa"/>
-              <w:start w:w="120" w:type="dxa"/>
-              <w:bottom w:w="100" w:type="dxa"/>
-              <w:end w:w="120" w:type="dxa"/>
-            </w:tcMar>
-          </w:tcPr>
-          <w:p>
-            <w:r>
-              <w:t>1–6</w:t>
-            </w:r>
-          </w:p>
-        </w:tc>
-        <w:tc>
-          <w:tcPr>
-            <w:tcW w:type="dxa" w:w="3389"/>
-            <w:shd w:fill="F4F7F4"/>
-            <w:tcMar>
-              <w:top w:w="100" w:type="dxa"/>
-              <w:start w:w="120" w:type="dxa"/>
-              <w:bottom w:w="100" w:type="dxa"/>
-              <w:end w:w="120" w:type="dxa"/>
-            </w:tcMar>
-          </w:tcPr>
-          <w:p>
-            <w:r>
-              <w:t>Problema, objetivos y Poisson</w:t>
-            </w:r>
-          </w:p>
-        </w:tc>
-      </w:tr>
-      <w:tr>
-        <w:tc>
-          <w:tcPr>
-            <w:tcW w:type="dxa" w:w="3389"/>
-            <w:shd w:fill="E8EFEA"/>
-            <w:tcMar>
-              <w:top w:w="100" w:type="dxa"/>
-              <w:start w:w="120" w:type="dxa"/>
-              <w:bottom w:w="100" w:type="dxa"/>
-              <w:end w:w="120" w:type="dxa"/>
-            </w:tcMar>
-          </w:tcPr>
-          <w:p>
-            <w:r>
-              <w:t>Jorge Palacios</w:t>
-            </w:r>
-          </w:p>
-        </w:tc>
-        <w:tc>
-          <w:tcPr>
-            <w:tcW w:type="dxa" w:w="3389"/>
-            <w:shd w:fill="E8EFEA"/>
-            <w:tcMar>
-              <w:top w:w="100" w:type="dxa"/>
-              <w:start w:w="120" w:type="dxa"/>
-              <w:bottom w:w="100" w:type="dxa"/>
-              <w:end w:w="120" w:type="dxa"/>
-            </w:tcMar>
-          </w:tcPr>
-          <w:p>
-            <w:r>
-              <w:t>7–13</w:t>
-            </w:r>
-          </w:p>
-        </w:tc>
-        <w:tc>
-          <w:tcPr>
-            <w:tcW w:type="dxa" w:w="3389"/>
-            <w:shd w:fill="E8EFEA"/>
-            <w:tcMar>
-              <w:top w:w="100" w:type="dxa"/>
-              <w:start w:w="120" w:type="dxa"/>
-              <w:bottom w:w="100" w:type="dxa"/>
-              <w:end w:w="120" w:type="dxa"/>
-            </w:tcMar>
-          </w:tcPr>
-          <w:p>
-            <w:r>
-              <w:t>Polar, validación y modelo</w:t>
-            </w:r>
-          </w:p>
-        </w:tc>
-      </w:tr>
-      <w:tr>
-        <w:tc>
-          <w:tcPr>
-            <w:tcW w:type="dxa" w:w="3389"/>
-            <w:shd w:fill="F4F7F4"/>
-            <w:tcMar>
-              <w:top w:w="100" w:type="dxa"/>
-              <w:start w:w="120" w:type="dxa"/>
-              <w:bottom w:w="100" w:type="dxa"/>
-              <w:end w:w="120" w:type="dxa"/>
-            </w:tcMar>
-          </w:tcPr>
-          <w:p>
-            <w:r>
-              <w:t>Andrés Rafael Chivalán</w:t>
-            </w:r>
-          </w:p>
-        </w:tc>
-        <w:tc>
-          <w:tcPr>
-            <w:tcW w:type="dxa" w:w="3389"/>
-            <w:shd w:fill="F4F7F4"/>
-            <w:tcMar>
-              <w:top w:w="100" w:type="dxa"/>
-              <w:start w:w="120" w:type="dxa"/>
-              <w:bottom w:w="100" w:type="dxa"/>
-              <w:end w:w="120" w:type="dxa"/>
-            </w:tcMar>
-          </w:tcPr>
-          <w:p>
-            <w:r>
-              <w:t>14–19</w:t>
-            </w:r>
-          </w:p>
-        </w:tc>
-        <w:tc>
-          <w:tcPr>
-            <w:tcW w:type="dxa" w:w="3389"/>
-            <w:shd w:fill="F4F7F4"/>
-            <w:tcMar>
-              <w:top w:w="100" w:type="dxa"/>
-              <w:start w:w="120" w:type="dxa"/>
-              <w:bottom w:w="100" w:type="dxa"/>
-              <w:end w:w="120" w:type="dxa"/>
-            </w:tcMar>
-          </w:tcPr>
-          <w:p>
-            <w:r>
-              <w:t>Software, Monte Carlo y resultados</w:t>
-            </w:r>
-          </w:p>
-        </w:tc>
-      </w:tr>
-      <w:tr>
-        <w:tc>
-          <w:tcPr>
-            <w:tcW w:type="dxa" w:w="3389"/>
-            <w:shd w:fill="E8EFEA"/>
-            <w:tcMar>
-              <w:top w:w="100" w:type="dxa"/>
-              <w:start w:w="120" w:type="dxa"/>
-              <w:bottom w:w="100" w:type="dxa"/>
-              <w:end w:w="120" w:type="dxa"/>
-            </w:tcMar>
-          </w:tcPr>
-          <w:p>
-            <w:r>
-              <w:t>Javier Andrés Chen</w:t>
-            </w:r>
-          </w:p>
-        </w:tc>
-        <w:tc>
-          <w:tcPr>
-            <w:tcW w:type="dxa" w:w="3389"/>
-            <w:shd w:fill="E8EFEA"/>
-            <w:tcMar>
-              <w:top w:w="100" w:type="dxa"/>
-              <w:start w:w="120" w:type="dxa"/>
-              <w:bottom w:w="100" w:type="dxa"/>
-              <w:end w:w="120" w:type="dxa"/>
-            </w:tcMar>
-          </w:tcPr>
-          <w:p>
-            <w:r>
-              <w:t>20–25</w:t>
-            </w:r>
-          </w:p>
-        </w:tc>
-        <w:tc>
-          <w:tcPr>
-            <w:tcW w:type="dxa" w:w="3389"/>
-            <w:shd w:fill="E8EFEA"/>
-            <w:tcMar>
-              <w:top w:w="100" w:type="dxa"/>
-              <w:start w:w="120" w:type="dxa"/>
-              <w:bottom w:w="100" w:type="dxa"/>
-              <w:end w:w="120" w:type="dxa"/>
-            </w:tcMar>
-          </w:tcPr>
-          <w:p>
-            <w:r>
-              <w:t>Interpretación, demo y cierre</w:t>
-            </w:r>
-          </w:p>
-        </w:tc>
-      </w:tr>
-    </w:tbl>
+    <w:p>
+      <w:pPr>
+        <w:pStyle w:val="ListBullet"/>
+      </w:pPr>
+      <w:r>
+        <w:t>Aplicación Streamlit con botón SIMULAR MISIÓN y seis laboratorios.</w:t>
+      </w:r>
+    </w:p>
+    <w:p>
+      <w:pPr>
+        <w:pStyle w:val="ListBullet"/>
+      </w:pPr>
+      <w:r>
+        <w:t>README con teoría, instalación, resultados y limitaciones.</w:t>
+      </w:r>
+    </w:p>
+    <w:p>
+      <w:pPr>
+        <w:pStyle w:val="ListBullet"/>
+      </w:pPr>
+      <w:r>
+        <w:t>Informe LaTeX/PDF y CSV regenerables.</w:t>
+      </w:r>
+    </w:p>
+    <w:p>
+      <w:pPr>
+        <w:pStyle w:val="ListBullet"/>
+      </w:pPr>
+      <w:r>
+        <w:t>Presentación HTML offline y guion LaTeX/PDF dividido entre cuatro integrantes.</w:t>
+      </w:r>
+    </w:p>
+    <w:p>
+      <w:pPr>
+        <w:pStyle w:val="ListBullet"/>
+      </w:pPr>
+      <w:r>
+        <w:t>Ficha DOCX editable y ficha PDF con fuentes versionadas.</w:t>
+      </w:r>
+    </w:p>
     <w:p>
       <w:pPr>
         <w:pStyle w:val="Heading2"/>
       </w:pPr>
       <w:r>
-        <w:t>Acceso</w:t>
+        <w:t>Integrantes</w:t>
+      </w:r>
+    </w:p>
+    <w:p>
+      <w:r>
+        <w:t>Pablo Daniel Barillas Moreno · Jorge Palacios · Andrés Rafael Chivalán · Javier Andrés Chen</w:t>
       </w:r>
     </w:p>
     <w:p>
@@ -2575,80 +1376,21 @@
         <w:rPr>
           <w:b/>
         </w:rPr>
-        <w:t xml:space="preserve">Página del repositorio: </w:t>
+        <w:t xml:space="preserve">Repositorio: </w:t>
       </w:r>
       <w:hyperlink r:id="rId12">
         <w:r>
           <w:rPr>
-            <w:color w:val="3D7F99"/>
+            <w:color w:val="2E75B6"/>
             <w:u w:val="single"/>
           </w:rPr>
           <w:t>https://github.com/DanielBarillasM/Proyecto-1_Grupo-1_Modelacion-y-Simulacion_Sec-30</w:t>
         </w:r>
       </w:hyperlink>
     </w:p>
-    <w:p>
-      <w:r>
-        <w:rPr>
-          <w:b/>
-        </w:rPr>
-        <w:t xml:space="preserve">URL de clonación: </w:t>
-      </w:r>
-      <w:hyperlink r:id="rId15">
-        <w:r>
-          <w:rPr>
-            <w:color w:val="3D7F99"/>
-            <w:u w:val="single"/>
-          </w:rPr>
-          <w:t>https://github.com/DanielBarillasM/Proyecto-1_Grupo-1_Modelacion-y-Simulacion_Sec-30.git</w:t>
-        </w:r>
-      </w:hyperlink>
-    </w:p>
-    <w:tbl>
-      <w:tblPr>
-        <w:tblW w:type="auto" w:w="0"/>
-        <w:tblLook w:firstColumn="1" w:firstRow="1" w:lastColumn="0" w:lastRow="0" w:noHBand="0" w:noVBand="1" w:val="04A0"/>
-      </w:tblPr>
-      <w:tblGrid>
-        <w:gridCol w:w="10166"/>
-      </w:tblGrid>
-      <w:tr>
-        <w:tc>
-          <w:tcPr>
-            <w:tcW w:type="dxa" w:w="10166"/>
-            <w:shd w:fill="EDF3F6"/>
-            <w:tcMar>
-              <w:top w:w="150" w:type="dxa"/>
-              <w:start w:w="180" w:type="dxa"/>
-              <w:bottom w:w="150" w:type="dxa"/>
-              <w:end w:w="180" w:type="dxa"/>
-            </w:tcMar>
-          </w:tcPr>
-          <w:p>
-            <w:r>
-              <w:rPr>
-                <w:b/>
-                <w:color w:val="567D35"/>
-              </w:rPr>
-              <w:t xml:space="preserve">Uso académico: </w:t>
-            </w:r>
-            <w:r>
-              <w:t>La licencia MIT permite revisar, ejecutar y adaptar el software conservando el aviso de copyright. Los resultados deben interpretarse dentro de los supuestos y parámetros declarados.</w:t>
-            </w:r>
-          </w:p>
-        </w:tc>
-      </w:tr>
-    </w:tbl>
-    <w:p>
-      <w:pPr>
-        <w:spacing w:after="0"/>
-      </w:pPr>
-    </w:p>
     <w:sectPr>
-      <w:headerReference w:type="default" r:id="rId9"/>
-      <w:footerReference w:type="default" r:id="rId10"/>
       <w:pgSz w:w="12240" w:h="15840"/>
-      <w:pgMar w:top="979" w:right="1037" w:bottom="936" w:left="1037" w:header="720" w:footer="720" w:gutter="0"/>
+      <w:pgMar w:top="1020" w:right="1134" w:bottom="964" w:left="1134" w:header="720" w:footer="720" w:gutter="0"/>
       <w:cols w:space="720"/>
       <w:docGrid w:linePitch="360"/>
     </w:sectPr>
@@ -2661,17 +1403,14 @@
   <w:p>
     <w:pPr>
       <w:pStyle w:val="Footer"/>
-      <w:jc w:val="right"/>
+      <w:jc w:val="center"/>
     </w:pPr>
     <w:r>
       <w:rPr>
-        <w:color w:val="617067"/>
+        <w:color w:val="607068"/>
         <w:sz w:val="16"/>
       </w:rPr>
-      <w:t xml:space="preserve">OUTBREAK  |  Ficha del repositorio  |  </w:t>
-      <w:fldChar w:fldCharType="begin"/>
-      <w:instrText xml:space="preserve">PAGE</w:instrText>
-      <w:fldChar w:fldCharType="end"/>
+      <w:t>Proyecto 1 · Modelación y Simulación · Sección 30</w:t>
     </w:r>
   </w:p>
 </w:ftr>
@@ -2686,11 +1425,10 @@
     </w:pPr>
     <w:r>
       <w:rPr>
-        <w:b/>
-        <w:color w:val="567D35"/>
+        <w:color w:val="607068"/>
         <w:sz w:val="16"/>
       </w:rPr>
-      <w:t>CC2017  ·  GRUPO 1  ·  SECCIÓN 30</w:t>
+      <w:t>OUTBREAK  /  STOCHASTIC SURVIVAL LAB</w:t>
     </w:r>
   </w:p>
 </w:hdr>
@@ -3059,13 +1797,10 @@
     <w:name w:val="Normal"/>
     <w:qFormat/>
     <w:rsid w:val="00FC693F"/>
-    <w:pPr>
-      <w:spacing w:after="120" w:line="259" w:lineRule="auto"/>
-    </w:pPr>
     <w:rPr>
       <w:rFonts w:ascii="Aptos" w:hAnsi="Aptos"/>
-      <w:color w:val="202923"/>
-      <w:sz w:val="20"/>
+      <w:color w:val="0B100D"/>
+      <w:sz w:val="21"/>
     </w:rPr>
   </w:style>
   <w:style w:type="paragraph" w:styleId="Header">
@@ -3123,15 +1858,15 @@
     <w:pPr>
       <w:keepNext/>
       <w:keepLines/>
-      <w:spacing w:before="160" w:after="100"/>
+      <w:spacing w:before="480" w:after="0"/>
       <w:outlineLvl w:val="0"/>
     </w:pPr>
     <w:rPr>
       <w:rFonts w:asciiTheme="majorHAnsi" w:eastAsiaTheme="majorEastAsia" w:hAnsiTheme="majorHAnsi" w:cstheme="majorBidi" w:ascii="Aptos Display" w:hAnsi="Aptos Display"/>
       <w:b/>
       <w:bCs/>
-      <w:color w:val="567D35"/>
-      <w:sz w:val="40"/>
+      <w:color w:val="0B100D"/>
+      <w:sz w:val="38"/>
       <w:szCs w:val="28"/>
     </w:rPr>
   </w:style>
@@ -3147,14 +1882,14 @@
     <w:pPr>
       <w:keepNext/>
       <w:keepLines/>
-      <w:spacing w:before="160" w:after="100"/>
+      <w:spacing w:before="200" w:after="0"/>
       <w:outlineLvl w:val="1"/>
     </w:pPr>
     <w:rPr>
       <w:rFonts w:asciiTheme="majorHAnsi" w:eastAsiaTheme="majorEastAsia" w:hAnsiTheme="majorHAnsi" w:cstheme="majorBidi" w:ascii="Aptos Display" w:hAnsi="Aptos Display"/>
       <w:b/>
       <w:bCs/>
-      <w:color w:val="3D7F99"/>
+      <w:color w:val="276749"/>
       <w:sz w:val="26"/>
       <w:szCs w:val="26"/>
     </w:rPr>
@@ -3412,7 +2147,7 @@
       <w:pBdr>
         <w:bottom w:val="single" w:sz="8" w:space="4" w:color="4F81BD" w:themeColor="accent1"/>
       </w:pBdr>
-      <w:spacing w:after="100" w:line="240" w:lineRule="auto" w:before="160"/>
+      <w:spacing w:after="300" w:line="240" w:lineRule="auto"/>
       <w:contextualSpacing/>
     </w:pPr>
     <w:rPr>
@@ -3452,16 +2187,14 @@
       <w:numPr>
         <w:ilvl w:val="1"/>
       </w:numPr>
-      <w:spacing w:before="160" w:after="100"/>
     </w:pPr>
     <w:rPr>
-      <w:rFonts w:asciiTheme="majorHAnsi" w:eastAsiaTheme="majorEastAsia" w:hAnsiTheme="majorHAnsi" w:cstheme="majorBidi" w:ascii="Aptos Display" w:hAnsi="Aptos Display"/>
-      <w:b/>
+      <w:rFonts w:asciiTheme="majorHAnsi" w:eastAsiaTheme="majorEastAsia" w:hAnsiTheme="majorHAnsi" w:cstheme="majorBidi"/>
       <w:i/>
       <w:iCs/>
-      <w:color w:val="567D35"/>
+      <w:color w:val="4F81BD" w:themeColor="accent1"/>
       <w:spacing w:val="15"/>
-      <w:sz w:val="28"/>
+      <w:sz w:val="24"/>
       <w:szCs w:val="24"/>
     </w:rPr>
   </w:style>

</xml_diff>

<commit_message>
docs: add fifth team member across project documentation
Add Adrián Ricardo González Muralles as the fifth team member across the README, report, repository brief, presentation, and presentation script. Regenerate the PDF and DOCX deliverables, redistribute the 26 presentation slides among five members, and fix outdated documentation references.
</commit_message>
<xml_diff>
--- a/zombie_poisson_streamlit/presentation/ficha_repositorio.docx
+++ b/zombie_poisson_streamlit/presentation/ficha_repositorio.docx
@@ -1347,7 +1347,7 @@
         <w:pStyle w:val="ListBullet"/>
       </w:pPr>
       <w:r>
-        <w:t>Presentación HTML offline y guion LaTeX/PDF dividido entre cuatro integrantes.</w:t>
+        <w:t>Presentación HTML offline y guion LaTeX/PDF dividido entre cinco integrantes.</w:t>
       </w:r>
     </w:p>
     <w:p>
@@ -1368,7 +1368,7 @@
     </w:p>
     <w:p>
       <w:r>
-        <w:t>Pablo Daniel Barillas Moreno · Jorge Palacios · Andrés Rafael Chivalán · Javier Andrés Chen</w:t>
+        <w:t>Pablo Daniel Barillas Moreno · Jorge Palacios · Adrián Ricardo González Muralles · Andrés Rafael Chivalán · Javier Andrés Chen</w:t>
       </w:r>
     </w:p>
     <w:p>

</xml_diff>